<commit_message>
Implement kernel adaptive scheduling v8
</commit_message>
<xml_diff>
--- a/ORCHESTRA_OS_Real_World_Machine_Test_Checklist.docx
+++ b/ORCHESTRA_OS_Real_World_Machine_Test_Checklist.docx
@@ -24,7 +24,12 @@
         <w:t xml:space="preserve">Use: </w:t>
       </w:r>
       <w:r>
-        <w:t>☐ PASS   ☐ FAIL   ☐ BLOCKED   ☐ N/A    |    Record Test ID, date, kernel commit, hardware, workload, parameters, result and evidence for every applicable item.</w:t>
+        <w:t>☑ PASS   ✗ FAIL   ⊘ BLOCKED   ◐ INCONCLUSIVE   — N/A    |    Record Test ID, date, kernel commit, hardware, workload, parameters, result and evidence for every applicable item.</w:t>
+      </w:r>
+    </w:p>
+    <w:p>
+      <w:r>
+        <w:t>CAMPAIGN STATUS — 2026-08-14 Kali physical machine (HP Pro Tower 280 G9, i7-13700, 24 CPU, 15 GiB, Linux 7.0.12+kali-amd64). Decision: PARTIALLY_VALIDATED. Checklist 98 rows: 58 PASS / 3 FAIL / 24 BLOCKED / 10 INCONCLUSIVE / 3 N/A. High findings: F6 (6.12 kfunc vs 7.0 BTF, ported), F7 (DSQ-0 abort, enum restored), F8 (canonical actions not shown effective). Claim class: KERNEL_PROTOTYPED (attach/run/detach on this host); NOT EXPERIMENTALLY_VALIDATED, NOT DEPLOYMENT_READY. Evidence: artifacts/real-world/20260814-104600-kali-checklist/ (REAL_WORLD_TEST_REPORT.md, FINDINGS.md, CHECKLIST_STATUS.csv, RESULTS.json). Marked: ☑ PASS  ✗ FAIL  ⊘ BLOCKED  ◐ INCONCLUSIVE  — N/A. PASS on userspace-only items (Signal Bus, predictor, S1-S4/Q, controller, tamper) is USERSPACE_VALIDATED, not kernel evidence.</w:t>
       </w:r>
     </w:p>
     <w:p>
@@ -48,7 +53,7 @@
         <w:rPr>
           <w:b/>
         </w:rPr>
-        <w:t xml:space="preserve">☐ </w:t>
+        <w:t xml:space="preserve">☑ PASS </w:t>
       </w:r>
       <w:r>
         <w:t>Assign unique test-run ID</w:t>
@@ -63,7 +68,7 @@
         <w:rPr>
           <w:b/>
         </w:rPr>
-        <w:t xml:space="preserve">☐ </w:t>
+        <w:t xml:space="preserve">☑ PASS </w:t>
       </w:r>
       <w:r>
         <w:t>Record date/time and operator</w:t>
@@ -78,7 +83,7 @@
         <w:rPr>
           <w:b/>
         </w:rPr>
-        <w:t xml:space="preserve">☐ </w:t>
+        <w:t xml:space="preserve">☑ PASS </w:t>
       </w:r>
       <w:r>
         <w:t>Record ORCHESTRA-OS version/commit</w:t>
@@ -93,7 +98,7 @@
         <w:rPr>
           <w:b/>
         </w:rPr>
-        <w:t xml:space="preserve">☐ </w:t>
+        <w:t xml:space="preserve">☑ PASS </w:t>
       </w:r>
       <w:r>
         <w:t>Record Linux kernel version</w:t>
@@ -108,7 +113,7 @@
         <w:rPr>
           <w:b/>
         </w:rPr>
-        <w:t xml:space="preserve">☐ </w:t>
+        <w:t xml:space="preserve">☑ PASS </w:t>
       </w:r>
       <w:r>
         <w:t>Record compiler/toolchain version</w:t>
@@ -123,7 +128,7 @@
         <w:rPr>
           <w:b/>
         </w:rPr>
-        <w:t xml:space="preserve">☐ </w:t>
+        <w:t xml:space="preserve">☑ PASS </w:t>
       </w:r>
       <w:r>
         <w:t>Record kernel configuration</w:t>
@@ -138,7 +143,7 @@
         <w:rPr>
           <w:b/>
         </w:rPr>
-        <w:t xml:space="preserve">☐ </w:t>
+        <w:t xml:space="preserve">☑ PASS </w:t>
       </w:r>
       <w:r>
         <w:t>Record ORCHESTRA parameter configuration</w:t>
@@ -153,7 +158,7 @@
         <w:rPr>
           <w:b/>
         </w:rPr>
-        <w:t xml:space="preserve">☐ </w:t>
+        <w:t xml:space="preserve">☑ PASS </w:t>
       </w:r>
       <w:r>
         <w:t>Record workload version/commit</w:t>
@@ -168,7 +173,7 @@
         <w:rPr>
           <w:b/>
         </w:rPr>
-        <w:t xml:space="preserve">☐ </w:t>
+        <w:t xml:space="preserve">☑ PASS </w:t>
       </w:r>
       <w:r>
         <w:t>Record random seed where applicable</w:t>
@@ -183,7 +188,7 @@
         <w:rPr>
           <w:b/>
         </w:rPr>
-        <w:t xml:space="preserve">☐ </w:t>
+        <w:t xml:space="preserve">☑ PASS </w:t>
       </w:r>
       <w:r>
         <w:t>Record test duration and repetitions</w:t>
@@ -198,7 +203,7 @@
         <w:rPr>
           <w:b/>
         </w:rPr>
-        <w:t xml:space="preserve">☐ </w:t>
+        <w:t xml:space="preserve">☑ PASS </w:t>
       </w:r>
       <w:r>
         <w:t>Preserve raw logs, traces and workload results</w:t>
@@ -213,7 +218,7 @@
         <w:rPr>
           <w:b/>
         </w:rPr>
-        <w:t xml:space="preserve">☐ </w:t>
+        <w:t xml:space="preserve">☑ PASS </w:t>
       </w:r>
       <w:r>
         <w:t>Record CPU model, physical/logical CPUs, topology, NUMA, cache, RAM, storage, network, GPU if relevant, BIOS/UEFI, microcode</w:t>
@@ -228,7 +233,7 @@
         <w:rPr>
           <w:b/>
         </w:rPr>
-        <w:t xml:space="preserve">☐ </w:t>
+        <w:t xml:space="preserve">☑ PASS </w:t>
       </w:r>
       <w:r>
         <w:t>Verify machine boots normally</w:t>
@@ -243,7 +248,7 @@
         <w:rPr>
           <w:b/>
         </w:rPr>
-        <w:t xml:space="preserve">☐ </w:t>
+        <w:t xml:space="preserve">☑ PASS </w:t>
       </w:r>
       <w:r>
         <w:t>Check system/kernel logs for pre-existing errors</w:t>
@@ -258,7 +263,7 @@
         <w:rPr>
           <w:b/>
         </w:rPr>
-        <w:t xml:space="preserve">☐ </w:t>
+        <w:t xml:space="preserve">☑ PASS </w:t>
       </w:r>
       <w:r>
         <w:t>Check CPU temperature</w:t>
@@ -273,7 +278,7 @@
         <w:rPr>
           <w:b/>
         </w:rPr>
-        <w:t xml:space="preserve">☐ </w:t>
+        <w:t xml:space="preserve">☑ PASS </w:t>
       </w:r>
       <w:r>
         <w:t>Check memory/storage health</w:t>
@@ -288,7 +293,7 @@
         <w:rPr>
           <w:b/>
         </w:rPr>
-        <w:t xml:space="preserve">☐ </w:t>
+        <w:t xml:space="preserve">☑ PASS </w:t>
       </w:r>
       <w:r>
         <w:t>Check networking</w:t>
@@ -303,7 +308,7 @@
         <w:rPr>
           <w:b/>
         </w:rPr>
-        <w:t xml:space="preserve">☐ </w:t>
+        <w:t xml:space="preserve">☑ PASS </w:t>
       </w:r>
       <w:r>
         <w:t>Check background workload</w:t>
@@ -318,7 +323,7 @@
         <w:rPr>
           <w:b/>
         </w:rPr>
-        <w:t xml:space="preserve">☐ </w:t>
+        <w:t xml:space="preserve">☑ PASS </w:t>
       </w:r>
       <w:r>
         <w:t>Verify clock/time synchronization</w:t>
@@ -333,7 +338,7 @@
         <w:rPr>
           <w:b/>
         </w:rPr>
-        <w:t xml:space="preserve">☐ </w:t>
+        <w:t xml:space="preserve">☑ PASS </w:t>
       </w:r>
       <w:r>
         <w:t>Run and record baseline Linux scheduler results: CPU utilization, memory, load, context switches, migrations, latency, throughput, cache behavior, I/O, network and thermal behavior</w:t>
@@ -348,7 +353,7 @@
         <w:rPr>
           <w:b/>
         </w:rPr>
-        <w:t xml:space="preserve">☐ </w:t>
+        <w:t xml:space="preserve">☑ PASS </w:t>
       </w:r>
       <w:r>
         <w:t>Repeat baseline experiments and archive dataset</w:t>
@@ -375,7 +380,7 @@
         <w:rPr>
           <w:b/>
         </w:rPr>
-        <w:t xml:space="preserve">☐ </w:t>
+        <w:t xml:space="preserve">☑ PASS </w:t>
       </w:r>
       <w:r>
         <w:t>Verify ORCHESTRA source tree and intended kernel version</w:t>
@@ -390,7 +395,7 @@
         <w:rPr>
           <w:b/>
         </w:rPr>
-        <w:t xml:space="preserve">☐ </w:t>
+        <w:t xml:space="preserve">☑ PASS </w:t>
       </w:r>
       <w:r>
         <w:t>Verify required kernel options</w:t>
@@ -405,7 +410,7 @@
         <w:rPr>
           <w:b/>
         </w:rPr>
-        <w:t xml:space="preserve">☐ </w:t>
+        <w:t xml:space="preserve">⊘ BLOCKED </w:t>
       </w:r>
       <w:r>
         <w:t>Perform clean build</w:t>
@@ -420,7 +425,7 @@
         <w:rPr>
           <w:b/>
         </w:rPr>
-        <w:t xml:space="preserve">☐ </w:t>
+        <w:t xml:space="preserve">☑ PASS </w:t>
       </w:r>
       <w:r>
         <w:t>Review build warnings/errors</w:t>
@@ -435,7 +440,7 @@
         <w:rPr>
           <w:b/>
         </w:rPr>
-        <w:t xml:space="preserve">☐ </w:t>
+        <w:t xml:space="preserve">⊘ BLOCKED </w:t>
       </w:r>
       <w:r>
         <w:t>Generate kernel/modules</w:t>
@@ -450,7 +455,7 @@
         <w:rPr>
           <w:b/>
         </w:rPr>
-        <w:t xml:space="preserve">☐ </w:t>
+        <w:t xml:space="preserve">⊘ BLOCKED </w:t>
       </w:r>
       <w:r>
         <w:t>Install kernel</w:t>
@@ -465,7 +470,7 @@
         <w:rPr>
           <w:b/>
         </w:rPr>
-        <w:t xml:space="preserve">☐ </w:t>
+        <w:t xml:space="preserve">⊘ BLOCKED </w:t>
       </w:r>
       <w:r>
         <w:t>Verify bootloader entry</w:t>
@@ -480,7 +485,7 @@
         <w:rPr>
           <w:b/>
         </w:rPr>
-        <w:t xml:space="preserve">☐ </w:t>
+        <w:t xml:space="preserve">☑ PASS </w:t>
       </w:r>
       <w:r>
         <w:t>Retain known-good fallback kernel</w:t>
@@ -495,7 +500,7 @@
         <w:rPr>
           <w:b/>
         </w:rPr>
-        <w:t xml:space="preserve">☐ </w:t>
+        <w:t xml:space="preserve">⊘ BLOCKED </w:t>
       </w:r>
       <w:r>
         <w:t>Boot ORCHESTRA kernel</w:t>
@@ -510,7 +515,7 @@
         <w:rPr>
           <w:b/>
         </w:rPr>
-        <w:t xml:space="preserve">☐ </w:t>
+        <w:t xml:space="preserve">☑ PASS </w:t>
       </w:r>
       <w:r>
         <w:t>Confirm kernel/ORCHESTRA version</w:t>
@@ -525,7 +530,7 @@
         <w:rPr>
           <w:b/>
         </w:rPr>
-        <w:t xml:space="preserve">☐ </w:t>
+        <w:t xml:space="preserve">☑ PASS </w:t>
       </w:r>
       <w:r>
         <w:t>Confirm ORCHESTRA initialization</w:t>
@@ -540,7 +545,7 @@
         <w:rPr>
           <w:b/>
         </w:rPr>
-        <w:t xml:space="preserve">☐ </w:t>
+        <w:t xml:space="preserve">☑ PASS </w:t>
       </w:r>
       <w:r>
         <w:t>Check for kernel panic/oops/WARN</w:t>
@@ -555,7 +560,7 @@
         <w:rPr>
           <w:b/>
         </w:rPr>
-        <w:t xml:space="preserve">☐ </w:t>
+        <w:t xml:space="preserve">☑ PASS </w:t>
       </w:r>
       <w:r>
         <w:t>Confirm scheduler initialization</w:t>
@@ -570,7 +575,7 @@
         <w:rPr>
           <w:b/>
         </w:rPr>
-        <w:t xml:space="preserve">☐ </w:t>
+        <w:t xml:space="preserve">⊘ BLOCKED </w:t>
       </w:r>
       <w:r>
         <w:t>Confirm Signal Bus initialization</w:t>
@@ -585,7 +590,7 @@
         <w:rPr>
           <w:b/>
         </w:rPr>
-        <w:t xml:space="preserve">☐ </w:t>
+        <w:t xml:space="preserve">☑ PASS </w:t>
       </w:r>
       <w:r>
         <w:t>Confirm monitoring initialization</w:t>
@@ -600,7 +605,7 @@
         <w:rPr>
           <w:b/>
         </w:rPr>
-        <w:t xml:space="preserve">☐ </w:t>
+        <w:t xml:space="preserve">☑ PASS </w:t>
       </w:r>
       <w:r>
         <w:t>Verify storage/network/user-space operation</w:t>
@@ -615,7 +620,7 @@
         <w:rPr>
           <w:b/>
         </w:rPr>
-        <w:t xml:space="preserve">☐ </w:t>
+        <w:t xml:space="preserve">— N/A </w:t>
       </w:r>
       <w:r>
         <w:t>Boot fallback kernel</w:t>
@@ -630,7 +635,7 @@
         <w:rPr>
           <w:b/>
         </w:rPr>
-        <w:t xml:space="preserve">☐ </w:t>
+        <w:t xml:space="preserve">— N/A </w:t>
       </w:r>
       <w:r>
         <w:t>Verify fallback remains usable</w:t>
@@ -645,7 +650,7 @@
         <w:rPr>
           <w:b/>
         </w:rPr>
-        <w:t xml:space="preserve">☐ </w:t>
+        <w:t xml:space="preserve">☑ PASS </w:t>
       </w:r>
       <w:r>
         <w:t>Verify ORCHESTRA failure cannot prevent recovery</w:t>
@@ -660,7 +665,7 @@
         <w:rPr>
           <w:b/>
         </w:rPr>
-        <w:t xml:space="preserve">☐ </w:t>
+        <w:t xml:space="preserve">☑ PASS </w:t>
       </w:r>
       <w:r>
         <w:t>Verify disable/reset procedure</w:t>
@@ -687,7 +692,7 @@
         <w:rPr>
           <w:b/>
         </w:rPr>
-        <w:t xml:space="preserve">☐ </w:t>
+        <w:t xml:space="preserve">☑ PASS </w:t>
       </w:r>
       <w:r>
         <w:t>Verify scheduler initialization</w:t>
@@ -702,7 +707,7 @@
         <w:rPr>
           <w:b/>
         </w:rPr>
-        <w:t xml:space="preserve">☐ </w:t>
+        <w:t xml:space="preserve">☑ PASS </w:t>
       </w:r>
       <w:r>
         <w:t>Verify run queues and scheduler domains</w:t>
@@ -717,7 +722,7 @@
         <w:rPr>
           <w:b/>
         </w:rPr>
-        <w:t xml:space="preserve">☐ </w:t>
+        <w:t xml:space="preserve">☑ PASS </w:t>
       </w:r>
       <w:r>
         <w:t>Verify scheduler hooks</w:t>
@@ -732,7 +737,7 @@
         <w:rPr>
           <w:b/>
         </w:rPr>
-        <w:t xml:space="preserve">☐ </w:t>
+        <w:t xml:space="preserve">☑ PASS </w:t>
       </w:r>
       <w:r>
         <w:t>Verify existing scheduling classes remain functional</w:t>
@@ -747,7 +752,7 @@
         <w:rPr>
           <w:b/>
         </w:rPr>
-        <w:t xml:space="preserve">☐ </w:t>
+        <w:t xml:space="preserve">◐ INCONCLUSIVE </w:t>
       </w:r>
       <w:r>
         <w:t>Test ORCHESTRA path for eligible task</w:t>
@@ -762,7 +767,7 @@
         <w:rPr>
           <w:b/>
         </w:rPr>
-        <w:t xml:space="preserve">☐ </w:t>
+        <w:t xml:space="preserve">◐ INCONCLUSIVE </w:t>
       </w:r>
       <w:r>
         <w:t>Verify ineligible task bypasses ORCHESTRA</w:t>
@@ -777,7 +782,7 @@
         <w:rPr>
           <w:b/>
         </w:rPr>
-        <w:t xml:space="preserve">☐ </w:t>
+        <w:t xml:space="preserve">◐ INCONCLUSIVE </w:t>
       </w:r>
       <w:r>
         <w:t>Verify scheduling decision is generated/applied</w:t>
@@ -792,7 +797,7 @@
         <w:rPr>
           <w:b/>
         </w:rPr>
-        <w:t xml:space="preserve">☐ </w:t>
+        <w:t xml:space="preserve">◐ INCONCLUSIVE </w:t>
       </w:r>
       <w:r>
         <w:t>Test RUN</w:t>
@@ -807,7 +812,7 @@
         <w:rPr>
           <w:b/>
         </w:rPr>
-        <w:t xml:space="preserve">☐ </w:t>
+        <w:t xml:space="preserve">✗ FAIL </w:t>
       </w:r>
       <w:r>
         <w:t>Test SLEEP</w:t>
@@ -822,7 +827,7 @@
         <w:rPr>
           <w:b/>
         </w:rPr>
-        <w:t xml:space="preserve">☐ </w:t>
+        <w:t xml:space="preserve">✗ FAIL </w:t>
       </w:r>
       <w:r>
         <w:t>Test MIGRATE</w:t>
@@ -837,7 +842,7 @@
         <w:rPr>
           <w:b/>
         </w:rPr>
-        <w:t xml:space="preserve">☐ </w:t>
+        <w:t xml:space="preserve">◐ INCONCLUSIVE </w:t>
       </w:r>
       <w:r>
         <w:t>Test THROTTLE</w:t>
@@ -852,7 +857,7 @@
         <w:rPr>
           <w:b/>
         </w:rPr>
-        <w:t xml:space="preserve">☐ </w:t>
+        <w:t xml:space="preserve">◐ INCONCLUSIVE </w:t>
       </w:r>
       <w:r>
         <w:t>Test YIELD</w:t>
@@ -867,7 +872,7 @@
         <w:rPr>
           <w:b/>
         </w:rPr>
-        <w:t xml:space="preserve">☐ </w:t>
+        <w:t xml:space="preserve">☑ PASS </w:t>
       </w:r>
       <w:r>
         <w:t>Test invalid action handling</w:t>
@@ -882,7 +887,7 @@
         <w:rPr>
           <w:b/>
         </w:rPr>
-        <w:t xml:space="preserve">☐ </w:t>
+        <w:t xml:space="preserve">☑ PASS </w:t>
       </w:r>
       <w:r>
         <w:t>Test normal Linux tasks</w:t>
@@ -897,7 +902,7 @@
         <w:rPr>
           <w:b/>
         </w:rPr>
-        <w:t xml:space="preserve">☐ </w:t>
+        <w:t xml:space="preserve">◐ INCONCLUSIVE </w:t>
       </w:r>
       <w:r>
         <w:t>Test ORCHESTRA tasks</w:t>
@@ -912,7 +917,7 @@
         <w:rPr>
           <w:b/>
         </w:rPr>
-        <w:t xml:space="preserve">☐ </w:t>
+        <w:t xml:space="preserve">☑ PASS </w:t>
       </w:r>
       <w:r>
         <w:t>Test mixed scheduling classes</w:t>
@@ -927,7 +932,7 @@
         <w:rPr>
           <w:b/>
         </w:rPr>
-        <w:t xml:space="preserve">☐ </w:t>
+        <w:t xml:space="preserve">✗ FAIL </w:t>
       </w:r>
       <w:r>
         <w:t>Test task migration</w:t>
@@ -942,7 +947,7 @@
         <w:rPr>
           <w:b/>
         </w:rPr>
-        <w:t xml:space="preserve">☐ </w:t>
+        <w:t xml:space="preserve">◐ INCONCLUSIVE </w:t>
       </w:r>
       <w:r>
         <w:t>Test preemption</w:t>
@@ -957,7 +962,7 @@
         <w:rPr>
           <w:b/>
         </w:rPr>
-        <w:t xml:space="preserve">☐ </w:t>
+        <w:t xml:space="preserve">◐ INCONCLUSIVE </w:t>
       </w:r>
       <w:r>
         <w:t>Test wake-up</w:t>
@@ -972,7 +977,7 @@
         <w:rPr>
           <w:b/>
         </w:rPr>
-        <w:t xml:space="preserve">☐ </w:t>
+        <w:t xml:space="preserve">☑ PASS </w:t>
       </w:r>
       <w:r>
         <w:t>Test CPU affinity</w:t>
@@ -987,7 +992,7 @@
         <w:rPr>
           <w:b/>
         </w:rPr>
-        <w:t xml:space="preserve">☐ </w:t>
+        <w:t xml:space="preserve">◐ INCONCLUSIVE </w:t>
       </w:r>
       <w:r>
         <w:t>Test load balancing</w:t>
@@ -1014,7 +1019,7 @@
         <w:rPr>
           <w:b/>
         </w:rPr>
-        <w:t xml:space="preserve">☐ </w:t>
+        <w:t xml:space="preserve">☑ PASS </w:t>
       </w:r>
       <w:r>
         <w:t>Create SCHED_FIFO task and verify conventional deterministic scheduling</w:t>
@@ -1029,7 +1034,7 @@
         <w:rPr>
           <w:b/>
         </w:rPr>
-        <w:t xml:space="preserve">☐ </w:t>
+        <w:t xml:space="preserve">☑ PASS </w:t>
       </w:r>
       <w:r>
         <w:t>Create SCHED_RR task and verify conventional deterministic scheduling</w:t>
@@ -1044,7 +1049,7 @@
         <w:rPr>
           <w:b/>
         </w:rPr>
-        <w:t xml:space="preserve">☐ </w:t>
+        <w:t xml:space="preserve">☑ PASS </w:t>
       </w:r>
       <w:r>
         <w:t>Verify ORCHESTRA does not override RT tasks</w:t>
@@ -1059,7 +1064,7 @@
         <w:rPr>
           <w:b/>
         </w:rPr>
-        <w:t xml:space="preserve">☐ </w:t>
+        <w:t xml:space="preserve">☑ PASS </w:t>
       </w:r>
       <w:r>
         <w:t>Verify RT priority behavior</w:t>
@@ -1074,7 +1079,7 @@
         <w:rPr>
           <w:b/>
         </w:rPr>
-        <w:t xml:space="preserve">☐ </w:t>
+        <w:t xml:space="preserve">◐ INCONCLUSIVE </w:t>
       </w:r>
       <w:r>
         <w:t>Verify RT response behavior</w:t>
@@ -1089,7 +1094,7 @@
         <w:rPr>
           <w:b/>
         </w:rPr>
-        <w:t xml:space="preserve">☐ </w:t>
+        <w:t xml:space="preserve">◐ INCONCLUSIVE </w:t>
       </w:r>
       <w:r>
         <w:t>Run RT + ORCHESTRA CPU-bound workload</w:t>
@@ -1104,7 +1109,7 @@
         <w:rPr>
           <w:b/>
         </w:rPr>
-        <w:t xml:space="preserve">☐ </w:t>
+        <w:t xml:space="preserve">⊘ BLOCKED </w:t>
       </w:r>
       <w:r>
         <w:t>Run RT + memory workload</w:t>
@@ -1119,7 +1124,7 @@
         <w:rPr>
           <w:b/>
         </w:rPr>
-        <w:t xml:space="preserve">☐ </w:t>
+        <w:t xml:space="preserve">⊘ BLOCKED </w:t>
       </w:r>
       <w:r>
         <w:t>Run RT + I/O workload</w:t>
@@ -1134,7 +1139,7 @@
         <w:rPr>
           <w:b/>
         </w:rPr>
-        <w:t xml:space="preserve">☐ </w:t>
+        <w:t xml:space="preserve">⊘ BLOCKED </w:t>
       </w:r>
       <w:r>
         <w:t>Run RT + network workload</w:t>
@@ -1149,7 +1154,7 @@
         <w:rPr>
           <w:b/>
         </w:rPr>
-        <w:t xml:space="preserve">☐ </w:t>
+        <w:t xml:space="preserve">⊘ BLOCKED </w:t>
       </w:r>
       <w:r>
         <w:t>Check priority inversion</w:t>
@@ -1164,7 +1169,7 @@
         <w:rPr>
           <w:b/>
         </w:rPr>
-        <w:t xml:space="preserve">☐ </w:t>
+        <w:t xml:space="preserve">⊘ BLOCKED </w:t>
       </w:r>
       <w:r>
         <w:t>Check starvation</w:t>
@@ -1179,7 +1184,7 @@
         <w:rPr>
           <w:b/>
         </w:rPr>
-        <w:t xml:space="preserve">☐ </w:t>
+        <w:t xml:space="preserve">☑ PASS </w:t>
       </w:r>
       <w:r>
         <w:t>Check deadlock</w:t>
@@ -1194,7 +1199,7 @@
         <w:rPr>
           <w:b/>
         </w:rPr>
-        <w:t xml:space="preserve">☐ </w:t>
+        <w:t xml:space="preserve">☑ PASS </w:t>
       </w:r>
       <w:r>
         <w:t>Check system responsiveness</w:t>
@@ -1221,7 +1226,7 @@
         <w:rPr>
           <w:b/>
         </w:rPr>
-        <w:t xml:space="preserve">☐ </w:t>
+        <w:t xml:space="preserve">⊘ BLOCKED </w:t>
       </w:r>
       <w:r>
         <w:t>Verify CPU utilization acquisition</w:t>
@@ -1236,7 +1241,7 @@
         <w:rPr>
           <w:b/>
         </w:rPr>
-        <w:t xml:space="preserve">☐ </w:t>
+        <w:t xml:space="preserve">⊘ BLOCKED </w:t>
       </w:r>
       <w:r>
         <w:t>Verify memory-pressure acquisition</w:t>
@@ -1251,7 +1256,7 @@
         <w:rPr>
           <w:b/>
         </w:rPr>
-        <w:t xml:space="preserve">☐ </w:t>
+        <w:t xml:space="preserve">⊘ BLOCKED </w:t>
       </w:r>
       <w:r>
         <w:t>Verify cache-behavior acquisition</w:t>
@@ -1266,7 +1271,7 @@
         <w:rPr>
           <w:b/>
         </w:rPr>
-        <w:t xml:space="preserve">☐ </w:t>
+        <w:t xml:space="preserve">⊘ BLOCKED </w:t>
       </w:r>
       <w:r>
         <w:t>Verify thermal-state acquisition</w:t>
@@ -1281,7 +1286,7 @@
         <w:rPr>
           <w:b/>
         </w:rPr>
-        <w:t xml:space="preserve">☐ </w:t>
+        <w:t xml:space="preserve">⊘ BLOCKED </w:t>
       </w:r>
       <w:r>
         <w:t>Verify I/O activity acquisition</w:t>
@@ -1296,7 +1301,7 @@
         <w:rPr>
           <w:b/>
         </w:rPr>
-        <w:t xml:space="preserve">☐ </w:t>
+        <w:t xml:space="preserve">⊘ BLOCKED </w:t>
       </w:r>
       <w:r>
         <w:t>Verify network-utilization acquisition</w:t>
@@ -1311,7 +1316,7 @@
         <w:rPr>
           <w:b/>
         </w:rPr>
-        <w:t xml:space="preserve">☐ </w:t>
+        <w:t xml:space="preserve">⊘ BLOCKED </w:t>
       </w:r>
       <w:r>
         <w:t>Verify scheduler-queue statistics</w:t>
@@ -1326,7 +1331,7 @@
         <w:rPr>
           <w:b/>
         </w:rPr>
-        <w:t xml:space="preserve">☐ </w:t>
+        <w:t xml:space="preserve">⊘ BLOCKED </w:t>
       </w:r>
       <w:r>
         <w:t>Verify signal frame generation</w:t>
@@ -1341,7 +1346,7 @@
         <w:rPr>
           <w:b/>
         </w:rPr>
-        <w:t xml:space="preserve">☐ </w:t>
+        <w:t xml:space="preserve">⊘ BLOCKED </w:t>
       </w:r>
       <w:r>
         <w:t>Verify timestamp</w:t>
@@ -1356,7 +1361,7 @@
         <w:rPr>
           <w:b/>
         </w:rPr>
-        <w:t xml:space="preserve">☐ </w:t>
+        <w:t xml:space="preserve">⊘ BLOCKED </w:t>
       </w:r>
       <w:r>
         <w:t>Verify sequence number</w:t>
@@ -1371,7 +1376,7 @@
         <w:rPr>
           <w:b/>
         </w:rPr>
-        <w:t xml:space="preserve">☐ </w:t>
+        <w:t xml:space="preserve">⊘ BLOCKED </w:t>
       </w:r>
       <w:r>
         <w:t>Verify raw measurements</w:t>
@@ -1386,7 +1391,7 @@
         <w:rPr>
           <w:b/>
         </w:rPr>
-        <w:t xml:space="preserve">☐ </w:t>
+        <w:t xml:space="preserve">⊘ BLOCKED </w:t>
       </w:r>
       <w:r>
         <w:t>Verify predicted values</w:t>
@@ -1401,7 +1406,7 @@
         <w:rPr>
           <w:b/>
         </w:rPr>
-        <w:t xml:space="preserve">☐ </w:t>
+        <w:t xml:space="preserve">⊘ BLOCKED </w:t>
       </w:r>
       <w:r>
         <w:t>Verify confidence</w:t>
@@ -1416,7 +1421,7 @@
         <w:rPr>
           <w:b/>
         </w:rPr>
-        <w:t xml:space="preserve">☐ </w:t>
+        <w:t xml:space="preserve">⊘ BLOCKED </w:t>
       </w:r>
       <w:r>
         <w:t>Verify directive</w:t>
@@ -1431,7 +1436,7 @@
         <w:rPr>
           <w:b/>
         </w:rPr>
-        <w:t xml:space="preserve">☐ </w:t>
+        <w:t xml:space="preserve">⊘ BLOCKED </w:t>
       </w:r>
       <w:r>
         <w:t>Verify metadata/version</w:t>
@@ -1446,7 +1451,7 @@
         <w:rPr>
           <w:b/>
         </w:rPr>
-        <w:t xml:space="preserve">☐ </w:t>
+        <w:t xml:space="preserve">⊘ BLOCKED </w:t>
       </w:r>
       <w:r>
         <w:t>Measure signal update frequency and latency</w:t>
@@ -1461,7 +1466,7 @@
         <w:rPr>
           <w:b/>
         </w:rPr>
-        <w:t xml:space="preserve">☐ </w:t>
+        <w:t xml:space="preserve">⊘ BLOCKED </w:t>
       </w:r>
       <w:r>
         <w:t>Verify publication/replacement/expiry</w:t>
@@ -1476,7 +1481,7 @@
         <w:rPr>
           <w:b/>
         </w:rPr>
-        <w:t xml:space="preserve">☐ </w:t>
+        <w:t xml:space="preserve">⊘ BLOCKED </w:t>
       </w:r>
       <w:r>
         <w:t>Check lost/duplicate/inconsistent updates</w:t>
@@ -1491,7 +1496,7 @@
         <w:rPr>
           <w:b/>
         </w:rPr>
-        <w:t xml:space="preserve">☐ </w:t>
+        <w:t xml:space="preserve">⊘ BLOCKED </w:t>
       </w:r>
       <w:r>
         <w:t>Verify read-only shared-memory access</w:t>
@@ -1506,7 +1511,7 @@
         <w:rPr>
           <w:b/>
         </w:rPr>
-        <w:t xml:space="preserve">☐ </w:t>
+        <w:t xml:space="preserve">⊘ BLOCKED </w:t>
       </w:r>
       <w:r>
         <w:t>Verify unauthorized write fails</w:t>
@@ -1521,7 +1526,7 @@
         <w:rPr>
           <w:b/>
         </w:rPr>
-        <w:t xml:space="preserve">☐ </w:t>
+        <w:t xml:space="preserve">⊘ BLOCKED </w:t>
       </w:r>
       <w:r>
         <w:t>Test concurrent readers</w:t>
@@ -1536,7 +1541,7 @@
         <w:rPr>
           <w:b/>
         </w:rPr>
-        <w:t xml:space="preserve">☐ </w:t>
+        <w:t xml:space="preserve">⊘ BLOCKED </w:t>
       </w:r>
       <w:r>
         <w:t>Test multi-CPU reads</w:t>
@@ -1551,7 +1556,7 @@
         <w:rPr>
           <w:b/>
         </w:rPr>
-        <w:t xml:space="preserve">☐ </w:t>
+        <w:t xml:space="preserve">⊘ BLOCKED </w:t>
       </w:r>
       <w:r>
         <w:t>Check corruption/cache contention</w:t>
@@ -1566,7 +1571,7 @@
         <w:rPr>
           <w:b/>
         </w:rPr>
-        <w:t xml:space="preserve">☐ </w:t>
+        <w:t xml:space="preserve">⊘ BLOCKED </w:t>
       </w:r>
       <w:r>
         <w:t>Test mapping/unmapping and cleanup</w:t>
@@ -1581,7 +1586,7 @@
         <w:rPr>
           <w:b/>
         </w:rPr>
-        <w:t xml:space="preserve">☐ </w:t>
+        <w:t xml:space="preserve">⊘ BLOCKED </w:t>
       </w:r>
       <w:r>
         <w:t>Test multi-core signal consistency, sequence numbers, timestamps and synchronization latency</w:t>
@@ -1608,7 +1613,7 @@
         <w:rPr>
           <w:b/>
         </w:rPr>
-        <w:t xml:space="preserve">☐ </w:t>
+        <w:t xml:space="preserve">☑ PASS </w:t>
       </w:r>
       <w:r>
         <w:t>Valid signal accepted</w:t>
@@ -1623,7 +1628,7 @@
         <w:rPr>
           <w:b/>
         </w:rPr>
-        <w:t xml:space="preserve">☐ </w:t>
+        <w:t xml:space="preserve">☑ PASS </w:t>
       </w:r>
       <w:r>
         <w:t>Modified signal rejected</w:t>
@@ -1638,7 +1643,7 @@
         <w:rPr>
           <w:b/>
         </w:rPr>
-        <w:t xml:space="preserve">☐ </w:t>
+        <w:t xml:space="preserve">☑ PASS </w:t>
       </w:r>
       <w:r>
         <w:t>Invalid authentication rejected</w:t>
@@ -1653,7 +1658,7 @@
         <w:rPr>
           <w:b/>
         </w:rPr>
-        <w:t xml:space="preserve">☐ </w:t>
+        <w:t xml:space="preserve">☑ PASS </w:t>
       </w:r>
       <w:r>
         <w:t>Wrong key rejected</w:t>
@@ -1668,7 +1673,7 @@
         <w:rPr>
           <w:b/>
         </w:rPr>
-        <w:t xml:space="preserve">☐ </w:t>
+        <w:t xml:space="preserve">☑ PASS </w:t>
       </w:r>
       <w:r>
         <w:t>Corrupt frame rejected</w:t>
@@ -1683,7 +1688,7 @@
         <w:rPr>
           <w:b/>
         </w:rPr>
-        <w:t xml:space="preserve">☐ </w:t>
+        <w:t xml:space="preserve">☑ PASS </w:t>
       </w:r>
       <w:r>
         <w:t>Incomplete frame rejected</w:t>
@@ -1698,7 +1703,7 @@
         <w:rPr>
           <w:b/>
         </w:rPr>
-        <w:t xml:space="preserve">☐ </w:t>
+        <w:t xml:space="preserve">☑ PASS </w:t>
       </w:r>
       <w:r>
         <w:t>Duplicate frame handled</w:t>
@@ -1713,7 +1718,7 @@
         <w:rPr>
           <w:b/>
         </w:rPr>
-        <w:t xml:space="preserve">☐ </w:t>
+        <w:t xml:space="preserve">☑ PASS </w:t>
       </w:r>
       <w:r>
         <w:t>Old/stale frame rejected</w:t>
@@ -1728,7 +1733,7 @@
         <w:rPr>
           <w:b/>
         </w:rPr>
-        <w:t xml:space="preserve">☐ </w:t>
+        <w:t xml:space="preserve">☑ PASS </w:t>
       </w:r>
       <w:r>
         <w:t>Out-of-order frame handled</w:t>
@@ -1743,7 +1748,7 @@
         <w:rPr>
           <w:b/>
         </w:rPr>
-        <w:t xml:space="preserve">☐ </w:t>
+        <w:t xml:space="preserve">☑ PASS </w:t>
       </w:r>
       <w:r>
         <w:t>Invalid sequence rejected</w:t>
@@ -1758,7 +1763,7 @@
         <w:rPr>
           <w:b/>
         </w:rPr>
-        <w:t xml:space="preserve">☐ </w:t>
+        <w:t xml:space="preserve">⊘ BLOCKED </w:t>
       </w:r>
       <w:r>
         <w:t>Stop signal producer</w:t>
@@ -1773,7 +1778,7 @@
         <w:rPr>
           <w:b/>
         </w:rPr>
-        <w:t xml:space="preserve">☐ </w:t>
+        <w:t xml:space="preserve">⊘ BLOCKED </w:t>
       </w:r>
       <w:r>
         <w:t>Stop signal consumer</w:t>
@@ -1788,7 +1793,7 @@
         <w:rPr>
           <w:b/>
         </w:rPr>
-        <w:t xml:space="preserve">☐ </w:t>
+        <w:t xml:space="preserve">⊘ BLOCKED </w:t>
       </w:r>
       <w:r>
         <w:t>Delay signal</w:t>
@@ -1803,7 +1808,7 @@
         <w:rPr>
           <w:b/>
         </w:rPr>
-        <w:t xml:space="preserve">☐ </w:t>
+        <w:t xml:space="preserve">⊘ BLOCKED </w:t>
       </w:r>
       <w:r>
         <w:t>Interrupt publication</w:t>
@@ -1818,7 +1823,7 @@
         <w:rPr>
           <w:b/>
         </w:rPr>
-        <w:t xml:space="preserve">☐ </w:t>
+        <w:t xml:space="preserve">⊘ BLOCKED </w:t>
       </w:r>
       <w:r>
         <w:t>Temporarily remove signal availability</w:t>
@@ -1833,7 +1838,7 @@
         <w:rPr>
           <w:b/>
         </w:rPr>
-        <w:t xml:space="preserve">☐ </w:t>
+        <w:t xml:space="preserve">⊘ BLOCKED </w:t>
       </w:r>
       <w:r>
         <w:t>Restart/recover Signal Bus</w:t>
@@ -1848,7 +1853,7 @@
         <w:rPr>
           <w:b/>
         </w:rPr>
-        <w:t xml:space="preserve">☐ </w:t>
+        <w:t xml:space="preserve">⊘ BLOCKED </w:t>
       </w:r>
       <w:r>
         <w:t>Verify safe scheduler fallback</w:t>
@@ -1863,7 +1868,7 @@
         <w:rPr>
           <w:b/>
         </w:rPr>
-        <w:t xml:space="preserve">☐ </w:t>
+        <w:t xml:space="preserve">⊘ BLOCKED </w:t>
       </w:r>
       <w:r>
         <w:t>Verify recovery after valid signals resume</w:t>
@@ -1890,7 +1895,7 @@
         <w:rPr>
           <w:b/>
         </w:rPr>
-        <w:t xml:space="preserve">☐ </w:t>
+        <w:t xml:space="preserve">⊘ BLOCKED </w:t>
       </w:r>
       <w:r>
         <w:t>Verify predictor initialization</w:t>
@@ -1905,7 +1910,7 @@
         <w:rPr>
           <w:b/>
         </w:rPr>
-        <w:t xml:space="preserve">☐ </w:t>
+        <w:t xml:space="preserve">⊘ BLOCKED </w:t>
       </w:r>
       <w:r>
         <w:t>Verify historical samples</w:t>
@@ -1920,7 +1925,7 @@
         <w:rPr>
           <w:b/>
         </w:rPr>
-        <w:t xml:space="preserve">☐ </w:t>
+        <w:t xml:space="preserve">⊘ BLOCKED </w:t>
       </w:r>
       <w:r>
         <w:t>Generate prediction</w:t>
@@ -1935,7 +1940,7 @@
         <w:rPr>
           <w:b/>
         </w:rPr>
-        <w:t xml:space="preserve">☐ </w:t>
+        <w:t xml:space="preserve">⊘ BLOCKED </w:t>
       </w:r>
       <w:r>
         <w:t>Verify prediction timestamp/horizon</w:t>
@@ -1950,7 +1955,7 @@
         <w:rPr>
           <w:b/>
         </w:rPr>
-        <w:t xml:space="preserve">☐ </w:t>
+        <w:t xml:space="preserve">⊘ BLOCKED </w:t>
       </w:r>
       <w:r>
         <w:t>Verify scheduler consumes prediction</w:t>
@@ -1965,7 +1970,7 @@
         <w:rPr>
           <w:b/>
         </w:rPr>
-        <w:t xml:space="preserve">☐ </w:t>
+        <w:t xml:space="preserve">⊘ BLOCKED </w:t>
       </w:r>
       <w:r>
         <w:t>Verify prediction expiry/replacement</w:t>
@@ -1980,7 +1985,7 @@
         <w:rPr>
           <w:b/>
         </w:rPr>
-        <w:t xml:space="preserve">☐ </w:t>
+        <w:t xml:space="preserve">⊘ BLOCKED </w:t>
       </w:r>
       <w:r>
         <w:t>Test stable CPU load</w:t>
@@ -1995,7 +2000,7 @@
         <w:rPr>
           <w:b/>
         </w:rPr>
-        <w:t xml:space="preserve">☐ </w:t>
+        <w:t xml:space="preserve">⊘ BLOCKED </w:t>
       </w:r>
       <w:r>
         <w:t>Increasing load</w:t>
@@ -2010,7 +2015,7 @@
         <w:rPr>
           <w:b/>
         </w:rPr>
-        <w:t xml:space="preserve">☐ </w:t>
+        <w:t xml:space="preserve">⊘ BLOCKED </w:t>
       </w:r>
       <w:r>
         <w:t>Decreasing load</w:t>
@@ -2025,7 +2030,7 @@
         <w:rPr>
           <w:b/>
         </w:rPr>
-        <w:t xml:space="preserve">☐ </w:t>
+        <w:t xml:space="preserve">⊘ BLOCKED </w:t>
       </w:r>
       <w:r>
         <w:t>Periodic load</w:t>
@@ -2040,7 +2045,7 @@
         <w:rPr>
           <w:b/>
         </w:rPr>
-        <w:t xml:space="preserve">☐ </w:t>
+        <w:t xml:space="preserve">⊘ BLOCKED </w:t>
       </w:r>
       <w:r>
         <w:t>Sudden CPU spike/drop</w:t>
@@ -2055,7 +2060,7 @@
         <w:rPr>
           <w:b/>
         </w:rPr>
-        <w:t xml:space="preserve">☐ </w:t>
+        <w:t xml:space="preserve">⊘ BLOCKED </w:t>
       </w:r>
       <w:r>
         <w:t>Memory pressure</w:t>
@@ -2070,7 +2075,7 @@
         <w:rPr>
           <w:b/>
         </w:rPr>
-        <w:t xml:space="preserve">☐ </w:t>
+        <w:t xml:space="preserve">⊘ BLOCKED </w:t>
       </w:r>
       <w:r>
         <w:t>I/O burst</w:t>
@@ -2085,7 +2090,7 @@
         <w:rPr>
           <w:b/>
         </w:rPr>
-        <w:t xml:space="preserve">☐ </w:t>
+        <w:t xml:space="preserve">⊘ BLOCKED </w:t>
       </w:r>
       <w:r>
         <w:t>Network burst</w:t>
@@ -2100,7 +2105,7 @@
         <w:rPr>
           <w:b/>
         </w:rPr>
-        <w:t xml:space="preserve">☐ </w:t>
+        <w:t xml:space="preserve">⊘ BLOCKED </w:t>
       </w:r>
       <w:r>
         <w:t>Mixed workload</w:t>
@@ -2115,7 +2120,7 @@
         <w:rPr>
           <w:b/>
         </w:rPr>
-        <w:t xml:space="preserve">☐ </w:t>
+        <w:t xml:space="preserve">⊘ BLOCKED </w:t>
       </w:r>
       <w:r>
         <w:t>Record MAE</w:t>
@@ -2130,7 +2135,7 @@
         <w:rPr>
           <w:b/>
         </w:rPr>
-        <w:t xml:space="preserve">☐ </w:t>
+        <w:t xml:space="preserve">⊘ BLOCKED </w:t>
       </w:r>
       <w:r>
         <w:t>Record MSE/RMSE</w:t>
@@ -2145,7 +2150,7 @@
         <w:rPr>
           <w:b/>
         </w:rPr>
-        <w:t xml:space="preserve">☐ </w:t>
+        <w:t xml:space="preserve">⊘ BLOCKED </w:t>
       </w:r>
       <w:r>
         <w:t>Record forecast bias</w:t>
@@ -2160,7 +2165,7 @@
         <w:rPr>
           <w:b/>
         </w:rPr>
-        <w:t xml:space="preserve">☐ </w:t>
+        <w:t xml:space="preserve">⊘ BLOCKED </w:t>
       </w:r>
       <w:r>
         <w:t>Record prediction latency</w:t>
@@ -2175,7 +2180,7 @@
         <w:rPr>
           <w:b/>
         </w:rPr>
-        <w:t xml:space="preserve">☐ </w:t>
+        <w:t xml:space="preserve">⊘ BLOCKED </w:t>
       </w:r>
       <w:r>
         <w:t>Record confidence</w:t>
@@ -2190,7 +2195,7 @@
         <w:rPr>
           <w:b/>
         </w:rPr>
-        <w:t xml:space="preserve">☐ </w:t>
+        <w:t xml:space="preserve">⊘ BLOCKED </w:t>
       </w:r>
       <w:r>
         <w:t>Record prediction error distribution</w:t>
@@ -2205,7 +2210,7 @@
         <w:rPr>
           <w:b/>
         </w:rPr>
-        <w:t xml:space="preserve">☐ </w:t>
+        <w:t xml:space="preserve">⊘ BLOCKED </w:t>
       </w:r>
       <w:r>
         <w:t>Test high-confidence prediction</w:t>
@@ -2220,7 +2225,7 @@
         <w:rPr>
           <w:b/>
         </w:rPr>
-        <w:t xml:space="preserve">☐ </w:t>
+        <w:t xml:space="preserve">⊘ BLOCKED </w:t>
       </w:r>
       <w:r>
         <w:t>Test low-confidence prediction</w:t>
@@ -2235,7 +2240,7 @@
         <w:rPr>
           <w:b/>
         </w:rPr>
-        <w:t xml:space="preserve">☐ </w:t>
+        <w:t xml:space="preserve">⊘ BLOCKED </w:t>
       </w:r>
       <w:r>
         <w:t>Verify observed-state fallback</w:t>
@@ -2250,7 +2255,7 @@
         <w:rPr>
           <w:b/>
         </w:rPr>
-        <w:t xml:space="preserve">☐ </w:t>
+        <w:t xml:space="preserve">⊘ BLOCKED </w:t>
       </w:r>
       <w:r>
         <w:t>Verify predictor failure does not crash scheduler</w:t>
@@ -2265,7 +2270,7 @@
         <w:rPr>
           <w:b/>
         </w:rPr>
-        <w:t xml:space="preserve">☐ </w:t>
+        <w:t xml:space="preserve">⊘ BLOCKED </w:t>
       </w:r>
       <w:r>
         <w:t>Verify recovery</w:t>
@@ -2292,7 +2297,7 @@
         <w:rPr>
           <w:b/>
         </w:rPr>
-        <w:t xml:space="preserve">☐ </w:t>
+        <w:t xml:space="preserve">⊘ BLOCKED </w:t>
       </w:r>
       <w:r>
         <w:t>Verify state construction from CPU, memory, thermal, queue and predicted state</w:t>
@@ -2307,7 +2312,7 @@
         <w:rPr>
           <w:b/>
         </w:rPr>
-        <w:t xml:space="preserve">☐ </w:t>
+        <w:t xml:space="preserve">⊘ BLOCKED </w:t>
       </w:r>
       <w:r>
         <w:t>Test RUN decision</w:t>
@@ -2322,7 +2327,7 @@
         <w:rPr>
           <w:b/>
         </w:rPr>
-        <w:t xml:space="preserve">☐ </w:t>
+        <w:t xml:space="preserve">⊘ BLOCKED </w:t>
       </w:r>
       <w:r>
         <w:t>Test SLEEP decision</w:t>
@@ -2337,7 +2342,7 @@
         <w:rPr>
           <w:b/>
         </w:rPr>
-        <w:t xml:space="preserve">☐ </w:t>
+        <w:t xml:space="preserve">⊘ BLOCKED </w:t>
       </w:r>
       <w:r>
         <w:t>Test MIGRATE decision</w:t>
@@ -2352,7 +2357,7 @@
         <w:rPr>
           <w:b/>
         </w:rPr>
-        <w:t xml:space="preserve">☐ </w:t>
+        <w:t xml:space="preserve">⊘ BLOCKED </w:t>
       </w:r>
       <w:r>
         <w:t>Test THROTTLE decision</w:t>
@@ -2367,7 +2372,7 @@
         <w:rPr>
           <w:b/>
         </w:rPr>
-        <w:t xml:space="preserve">☐ </w:t>
+        <w:t xml:space="preserve">⊘ BLOCKED </w:t>
       </w:r>
       <w:r>
         <w:t>Test YIELD decision</w:t>
@@ -2382,7 +2387,7 @@
         <w:rPr>
           <w:b/>
         </w:rPr>
-        <w:t xml:space="preserve">☐ </w:t>
+        <w:t xml:space="preserve">⊘ BLOCKED </w:t>
       </w:r>
       <w:r>
         <w:t>Test invalid/missing state handling</w:t>
@@ -2397,7 +2402,7 @@
         <w:rPr>
           <w:b/>
         </w:rPr>
-        <w:t xml:space="preserve">☐ </w:t>
+        <w:t xml:space="preserve">⊘ BLOCKED </w:t>
       </w:r>
       <w:r>
         <w:t>Verify policy initialization/update</w:t>
@@ -2412,7 +2417,7 @@
         <w:rPr>
           <w:b/>
         </w:rPr>
-        <w:t xml:space="preserve">☐ </w:t>
+        <w:t xml:space="preserve">⊘ BLOCKED </w:t>
       </w:r>
       <w:r>
         <w:t>Verify reward generation</w:t>
@@ -2427,7 +2432,7 @@
         <w:rPr>
           <w:b/>
         </w:rPr>
-        <w:t xml:space="preserve">☐ </w:t>
+        <w:t xml:space="preserve">⊘ BLOCKED </w:t>
       </w:r>
       <w:r>
         <w:t>Check policy stability</w:t>
@@ -2442,7 +2447,7 @@
         <w:rPr>
           <w:b/>
         </w:rPr>
-        <w:t xml:space="preserve">☐ </w:t>
+        <w:t xml:space="preserve">⊘ BLOCKED </w:t>
       </w:r>
       <w:r>
         <w:t>Bound exploration</w:t>
@@ -2457,7 +2462,7 @@
         <w:rPr>
           <w:b/>
         </w:rPr>
-        <w:t xml:space="preserve">☐ </w:t>
+        <w:t xml:space="preserve">⊘ BLOCKED </w:t>
       </w:r>
       <w:r>
         <w:t>Record adaptation frequency</w:t>
@@ -2472,7 +2477,7 @@
         <w:rPr>
           <w:b/>
         </w:rPr>
-        <w:t xml:space="preserve">☐ </w:t>
+        <w:t xml:space="preserve">⊘ BLOCKED </w:t>
       </w:r>
       <w:r>
         <w:t>Test policy reset/suspension/recovery</w:t>
@@ -2487,7 +2492,7 @@
         <w:rPr>
           <w:b/>
         </w:rPr>
-        <w:t xml:space="preserve">☐ </w:t>
+        <w:t xml:space="preserve">⊘ BLOCKED </w:t>
       </w:r>
       <w:r>
         <w:t>Test synchronized migrations</w:t>
@@ -2502,7 +2507,7 @@
         <w:rPr>
           <w:b/>
         </w:rPr>
-        <w:t xml:space="preserve">☐ </w:t>
+        <w:t xml:space="preserve">⊘ BLOCKED </w:t>
       </w:r>
       <w:r>
         <w:t>wake-ups</w:t>
@@ -2517,7 +2522,7 @@
         <w:rPr>
           <w:b/>
         </w:rPr>
-        <w:t xml:space="preserve">☐ </w:t>
+        <w:t xml:space="preserve">⊘ BLOCKED </w:t>
       </w:r>
       <w:r>
         <w:t>sleep</w:t>
@@ -2532,7 +2537,7 @@
         <w:rPr>
           <w:b/>
         </w:rPr>
-        <w:t xml:space="preserve">☐ </w:t>
+        <w:t xml:space="preserve">⊘ BLOCKED </w:t>
       </w:r>
       <w:r>
         <w:t>throttling</w:t>
@@ -2547,7 +2552,7 @@
         <w:rPr>
           <w:b/>
         </w:rPr>
-        <w:t xml:space="preserve">☐ </w:t>
+        <w:t xml:space="preserve">⊘ BLOCKED </w:t>
       </w:r>
       <w:r>
         <w:t>collective oscillation</w:t>
@@ -2562,7 +2567,7 @@
         <w:rPr>
           <w:b/>
         </w:rPr>
-        <w:t xml:space="preserve">☐ </w:t>
+        <w:t xml:space="preserve">⊘ BLOCKED </w:t>
       </w:r>
       <w:r>
         <w:t>mass switching</w:t>
@@ -2577,7 +2582,7 @@
         <w:rPr>
           <w:b/>
         </w:rPr>
-        <w:t xml:space="preserve">☐ </w:t>
+        <w:t xml:space="preserve">⊘ BLOCKED </w:t>
       </w:r>
       <w:r>
         <w:t>CPU hot-spot formation</w:t>
@@ -2592,7 +2597,7 @@
         <w:rPr>
           <w:b/>
         </w:rPr>
-        <w:t xml:space="preserve">☐ </w:t>
+        <w:t xml:space="preserve">⊘ BLOCKED </w:t>
       </w:r>
       <w:r>
         <w:t>load oscillation</w:t>
@@ -2619,7 +2624,7 @@
         <w:rPr>
           <w:b/>
         </w:rPr>
-        <w:t xml:space="preserve">☐ </w:t>
+        <w:t xml:space="preserve">⊘ BLOCKED </w:t>
       </w:r>
       <w:r>
         <w:t>S1: measure signal freshness</w:t>
@@ -2634,7 +2639,7 @@
         <w:rPr>
           <w:b/>
         </w:rPr>
-        <w:t xml:space="preserve">☐ </w:t>
+        <w:t xml:space="preserve">⊘ BLOCKED </w:t>
       </w:r>
       <w:r>
         <w:t>S1: measure forecast accuracy</w:t>
@@ -2649,7 +2654,7 @@
         <w:rPr>
           <w:b/>
         </w:rPr>
-        <w:t xml:space="preserve">☐ </w:t>
+        <w:t xml:space="preserve">⊘ BLOCKED </w:t>
       </w:r>
       <w:r>
         <w:t>S1: measure signal age/prediction divergence</w:t>
@@ -2664,7 +2669,7 @@
         <w:rPr>
           <w:b/>
         </w:rPr>
-        <w:t xml:space="preserve">☐ </w:t>
+        <w:t xml:space="preserve">⊘ BLOCKED </w:t>
       </w:r>
       <w:r>
         <w:t>S2: verify eligible/exempt counts</w:t>
@@ -2679,7 +2684,7 @@
         <w:rPr>
           <w:b/>
         </w:rPr>
-        <w:t xml:space="preserve">☐ </w:t>
+        <w:t xml:space="preserve">⊘ BLOCKED </w:t>
       </w:r>
       <w:r>
         <w:t>S2: count compliant/non-compliant actions</w:t>
@@ -2694,7 +2699,7 @@
         <w:rPr>
           <w:b/>
         </w:rPr>
-        <w:t xml:space="preserve">☐ </w:t>
+        <w:t xml:space="preserve">⊘ BLOCKED </w:t>
       </w:r>
       <w:r>
         <w:t>S2: verify calculation</w:t>
@@ -2709,7 +2714,7 @@
         <w:rPr>
           <w:b/>
         </w:rPr>
-        <w:t xml:space="preserve">☐ </w:t>
+        <w:t xml:space="preserve">⊘ BLOCKED </w:t>
       </w:r>
       <w:r>
         <w:t>S3: capture action distribution</w:t>
@@ -2724,7 +2729,7 @@
         <w:rPr>
           <w:b/>
         </w:rPr>
-        <w:t xml:space="preserve">☐ </w:t>
+        <w:t xml:space="preserve">⊘ BLOCKED </w:t>
       </w:r>
       <w:r>
         <w:t>S3: measure action consistency</w:t>
@@ -2739,7 +2744,7 @@
         <w:rPr>
           <w:b/>
         </w:rPr>
-        <w:t xml:space="preserve">☐ </w:t>
+        <w:t xml:space="preserve">⊘ BLOCKED </w:t>
       </w:r>
       <w:r>
         <w:t>S3: detect divergent behavior</w:t>
@@ -2754,7 +2759,7 @@
         <w:rPr>
           <w:b/>
         </w:rPr>
-        <w:t xml:space="preserve">☐ </w:t>
+        <w:t xml:space="preserve">⊘ BLOCKED </w:t>
       </w:r>
       <w:r>
         <w:t>S3: calculate population coherence</w:t>
@@ -2769,7 +2774,7 @@
         <w:rPr>
           <w:b/>
         </w:rPr>
-        <w:t xml:space="preserve">☐ </w:t>
+        <w:t xml:space="preserve">⊘ BLOCKED </w:t>
       </w:r>
       <w:r>
         <w:t>S4: record previous/current actions</w:t>
@@ -2784,7 +2789,7 @@
         <w:rPr>
           <w:b/>
         </w:rPr>
-        <w:t xml:space="preserve">☐ </w:t>
+        <w:t xml:space="preserve">⊘ BLOCKED </w:t>
       </w:r>
       <w:r>
         <w:t>S4: count transitions</w:t>
@@ -2799,7 +2804,7 @@
         <w:rPr>
           <w:b/>
         </w:rPr>
-        <w:t xml:space="preserve">☐ </w:t>
+        <w:t xml:space="preserve">⊘ BLOCKED </w:t>
       </w:r>
       <w:r>
         <w:t>S4: detect mass switching</w:t>
@@ -2814,7 +2819,7 @@
         <w:rPr>
           <w:b/>
         </w:rPr>
-        <w:t xml:space="preserve">☐ </w:t>
+        <w:t xml:space="preserve">⊘ BLOCKED </w:t>
       </w:r>
       <w:r>
         <w:t>S4: detect oscillation</w:t>
@@ -2829,7 +2834,7 @@
         <w:rPr>
           <w:b/>
         </w:rPr>
-        <w:t xml:space="preserve">☐ </w:t>
+        <w:t xml:space="preserve">⊘ BLOCKED </w:t>
       </w:r>
       <w:r>
         <w:t>S4: calculate temporal stability</w:t>
@@ -2844,7 +2849,7 @@
         <w:rPr>
           <w:b/>
         </w:rPr>
-        <w:t xml:space="preserve">☐ </w:t>
+        <w:t xml:space="preserve">⊘ BLOCKED </w:t>
       </w:r>
       <w:r>
         <w:t>Verify composite Q calculation</w:t>
@@ -2859,7 +2864,7 @@
         <w:rPr>
           <w:b/>
         </w:rPr>
-        <w:t xml:space="preserve">☐ </w:t>
+        <w:t xml:space="preserve">⊘ BLOCKED </w:t>
       </w:r>
       <w:r>
         <w:t>Verify Q range</w:t>
@@ -2874,7 +2879,7 @@
         <w:rPr>
           <w:b/>
         </w:rPr>
-        <w:t xml:space="preserve">☐ </w:t>
+        <w:t xml:space="preserve">⊘ BLOCKED </w:t>
       </w:r>
       <w:r>
         <w:t>Verify Q responds to coordination degradation</w:t>
@@ -2889,7 +2894,7 @@
         <w:rPr>
           <w:b/>
         </w:rPr>
-        <w:t xml:space="preserve">☐ </w:t>
+        <w:t xml:space="preserve">⊘ BLOCKED </w:t>
       </w:r>
       <w:r>
         <w:t>Verify Q improves with coordination</w:t>
@@ -2904,7 +2909,7 @@
         <w:rPr>
           <w:b/>
         </w:rPr>
-        <w:t xml:space="preserve">☐ </w:t>
+        <w:t xml:space="preserve">⊘ BLOCKED </w:t>
       </w:r>
       <w:r>
         <w:t>Verify Q remains meaningful under synchronized behavior</w:t>
@@ -2919,7 +2924,7 @@
         <w:rPr>
           <w:b/>
         </w:rPr>
-        <w:t xml:space="preserve">☐ </w:t>
+        <w:t xml:space="preserve">⊘ BLOCKED </w:t>
       </w:r>
       <w:r>
         <w:t>Verify process/core/system aggregation</w:t>
@@ -2946,7 +2951,7 @@
         <w:rPr>
           <w:b/>
         </w:rPr>
-        <w:t xml:space="preserve">☐ </w:t>
+        <w:t xml:space="preserve">⊘ BLOCKED </w:t>
       </w:r>
       <w:r>
         <w:t>Verify controller initialization</w:t>
@@ -2961,7 +2966,7 @@
         <w:rPr>
           <w:b/>
         </w:rPr>
-        <w:t xml:space="preserve">☐ </w:t>
+        <w:t xml:space="preserve">⊘ BLOCKED </w:t>
       </w:r>
       <w:r>
         <w:t>Verify controller reads Q</w:t>
@@ -2976,7 +2981,7 @@
         <w:rPr>
           <w:b/>
         </w:rPr>
-        <w:t xml:space="preserve">☐ </w:t>
+        <w:t xml:space="preserve">⊘ BLOCKED </w:t>
       </w:r>
       <w:r>
         <w:t>Verify deficient sub-metric identification</w:t>
@@ -2991,7 +2996,7 @@
         <w:rPr>
           <w:b/>
         </w:rPr>
-        <w:t xml:space="preserve">☐ </w:t>
+        <w:t xml:space="preserve">⊘ BLOCKED </w:t>
       </w:r>
       <w:r>
         <w:t>Verify actuator selection</w:t>
@@ -3006,7 +3011,7 @@
         <w:rPr>
           <w:b/>
         </w:rPr>
-        <w:t xml:space="preserve">☐ </w:t>
+        <w:t xml:space="preserve">⊘ BLOCKED </w:t>
       </w:r>
       <w:r>
         <w:t>Verify parameter update</w:t>
@@ -3021,7 +3026,7 @@
         <w:rPr>
           <w:b/>
         </w:rPr>
-        <w:t xml:space="preserve">☐ </w:t>
+        <w:t xml:space="preserve">⊘ BLOCKED </w:t>
       </w:r>
       <w:r>
         <w:t>Verify parameter bounds</w:t>
@@ -3036,7 +3041,7 @@
         <w:rPr>
           <w:b/>
         </w:rPr>
-        <w:t xml:space="preserve">☐ </w:t>
+        <w:t xml:space="preserve">⊘ BLOCKED </w:t>
       </w:r>
       <w:r>
         <w:t>Check controller oscillation/saturation</w:t>
@@ -3051,7 +3056,7 @@
         <w:rPr>
           <w:b/>
         </w:rPr>
-        <w:t xml:space="preserve">☐ </w:t>
+        <w:t xml:space="preserve">⊘ BLOCKED </w:t>
       </w:r>
       <w:r>
         <w:t>Measure stabilization</w:t>
@@ -3066,7 +3071,7 @@
         <w:rPr>
           <w:b/>
         </w:rPr>
-        <w:t xml:space="preserve">☐ </w:t>
+        <w:t xml:space="preserve">⊘ BLOCKED </w:t>
       </w:r>
       <w:r>
         <w:t>Test per-agent perceptual jitter actuator</w:t>
@@ -3081,7 +3086,7 @@
         <w:rPr>
           <w:b/>
         </w:rPr>
-        <w:t xml:space="preserve">☐ </w:t>
+        <w:t xml:space="preserve">⊘ BLOCKED </w:t>
       </w:r>
       <w:r>
         <w:t>Test switching-penalty actuator</w:t>
@@ -3096,7 +3101,7 @@
         <w:rPr>
           <w:b/>
         </w:rPr>
-        <w:t xml:space="preserve">☐ </w:t>
+        <w:t xml:space="preserve">⊘ BLOCKED </w:t>
       </w:r>
       <w:r>
         <w:t>Test Q-table consensus mechanism</w:t>
@@ -3111,7 +3116,7 @@
         <w:rPr>
           <w:b/>
         </w:rPr>
-        <w:t xml:space="preserve">☐ </w:t>
+        <w:t xml:space="preserve">⊘ BLOCKED </w:t>
       </w:r>
       <w:r>
         <w:t>Test prediction-horizon actuator</w:t>
@@ -3126,7 +3131,7 @@
         <w:rPr>
           <w:b/>
         </w:rPr>
-        <w:t xml:space="preserve">☐ </w:t>
+        <w:t xml:space="preserve">⊘ BLOCKED </w:t>
       </w:r>
       <w:r>
         <w:t>Test signal-update-frequency actuator</w:t>
@@ -3141,7 +3146,7 @@
         <w:rPr>
           <w:b/>
         </w:rPr>
-        <w:t xml:space="preserve">☐ </w:t>
+        <w:t xml:space="preserve">⊘ BLOCKED </w:t>
       </w:r>
       <w:r>
         <w:t>Test scheduling thresholds</w:t>
@@ -3156,7 +3161,7 @@
         <w:rPr>
           <w:b/>
         </w:rPr>
-        <w:t xml:space="preserve">☐ </w:t>
+        <w:t xml:space="preserve">⊘ BLOCKED </w:t>
       </w:r>
       <w:r>
         <w:t>Verify inner adaptation and slower outer controller</w:t>
@@ -3171,7 +3176,7 @@
         <w:rPr>
           <w:b/>
         </w:rPr>
-        <w:t xml:space="preserve">☐ </w:t>
+        <w:t xml:space="preserve">⊘ BLOCKED </w:t>
       </w:r>
       <w:r>
         <w:t>Record controller cadence/step size</w:t>
@@ -3186,7 +3191,7 @@
         <w:rPr>
           <w:b/>
         </w:rPr>
-        <w:t xml:space="preserve">☐ </w:t>
+        <w:t xml:space="preserve">⊘ BLOCKED </w:t>
       </w:r>
       <w:r>
         <w:t>Record parameter evolution</w:t>
@@ -3201,7 +3206,7 @@
         <w:rPr>
           <w:b/>
         </w:rPr>
-        <w:t xml:space="preserve">☐ </w:t>
+        <w:t xml:space="preserve">⊘ BLOCKED </w:t>
       </w:r>
       <w:r>
         <w:t>Check learner/controller feedback oscillation</w:t>
@@ -3228,7 +3233,7 @@
         <w:rPr>
           <w:b/>
         </w:rPr>
-        <w:t xml:space="preserve">☐ </w:t>
+        <w:t xml:space="preserve">☑ PASS </w:t>
       </w:r>
       <w:r>
         <w:t>Trace dispatch</w:t>
@@ -3243,7 +3248,7 @@
         <w:rPr>
           <w:b/>
         </w:rPr>
-        <w:t xml:space="preserve">☐ </w:t>
+        <w:t xml:space="preserve">☑ PASS </w:t>
       </w:r>
       <w:r>
         <w:t>Trace migration</w:t>
@@ -3258,7 +3263,7 @@
         <w:rPr>
           <w:b/>
         </w:rPr>
-        <w:t xml:space="preserve">☐ </w:t>
+        <w:t xml:space="preserve">◐ INCONCLUSIVE </w:t>
       </w:r>
       <w:r>
         <w:t>Trace preemption</w:t>
@@ -3273,7 +3278,7 @@
         <w:rPr>
           <w:b/>
         </w:rPr>
-        <w:t xml:space="preserve">☐ </w:t>
+        <w:t xml:space="preserve">☑ PASS </w:t>
       </w:r>
       <w:r>
         <w:t>Trace throttling</w:t>
@@ -3288,7 +3293,7 @@
         <w:rPr>
           <w:b/>
         </w:rPr>
-        <w:t xml:space="preserve">☐ </w:t>
+        <w:t xml:space="preserve">☑ PASS </w:t>
       </w:r>
       <w:r>
         <w:t>Trace yield</w:t>
@@ -3303,7 +3308,7 @@
         <w:rPr>
           <w:b/>
         </w:rPr>
-        <w:t xml:space="preserve">☐ </w:t>
+        <w:t xml:space="preserve">☑ PASS </w:t>
       </w:r>
       <w:r>
         <w:t>Trace sleep/wake</w:t>
@@ -3318,7 +3323,7 @@
         <w:rPr>
           <w:b/>
         </w:rPr>
-        <w:t xml:space="preserve">☐ </w:t>
+        <w:t xml:space="preserve">◐ INCONCLUSIVE </w:t>
       </w:r>
       <w:r>
         <w:t>Trace scheduling decisions and associated signal state</w:t>
@@ -3333,7 +3338,7 @@
         <w:rPr>
           <w:b/>
         </w:rPr>
-        <w:t xml:space="preserve">☐ </w:t>
+        <w:t xml:space="preserve">⊘ BLOCKED </w:t>
       </w:r>
       <w:r>
         <w:t>Trace signal creation/publication/dissemination/validation/expiry/replacement</w:t>
@@ -3348,7 +3353,7 @@
         <w:rPr>
           <w:b/>
         </w:rPr>
-        <w:t xml:space="preserve">☐ </w:t>
+        <w:t xml:space="preserve">⊘ BLOCKED </w:t>
       </w:r>
       <w:r>
         <w:t>Measure signal propagation latency</w:t>
@@ -3363,7 +3368,7 @@
         <w:rPr>
           <w:b/>
         </w:rPr>
-        <w:t xml:space="preserve">☐ </w:t>
+        <w:t xml:space="preserve">☑ PASS </w:t>
       </w:r>
       <w:r>
         <w:t>Record synchronization/integrity failures</w:t>
@@ -3378,7 +3383,7 @@
         <w:rPr>
           <w:b/>
         </w:rPr>
-        <w:t xml:space="preserve">☐ </w:t>
+        <w:t xml:space="preserve">⊘ BLOCKED </w:t>
       </w:r>
       <w:r>
         <w:t>Record prediction generation time/value/confidence/error/latency/model version</w:t>
@@ -3393,7 +3398,7 @@
         <w:rPr>
           <w:b/>
         </w:rPr>
-        <w:t xml:space="preserve">☐ </w:t>
+        <w:t xml:space="preserve">◐ INCONCLUSIVE </w:t>
       </w:r>
       <w:r>
         <w:t>Record scheduler state/action/policy/reward/adaptation/migration/decision latency</w:t>
@@ -3408,7 +3413,7 @@
         <w:rPr>
           <w:b/>
         </w:rPr>
-        <w:t xml:space="preserve">☐ </w:t>
+        <w:t xml:space="preserve">⊘ BLOCKED </w:t>
       </w:r>
       <w:r>
         <w:t>Record S1/S2/S3/S4/Q</w:t>
@@ -3423,7 +3428,7 @@
         <w:rPr>
           <w:b/>
         </w:rPr>
-        <w:t xml:space="preserve">☐ </w:t>
+        <w:t xml:space="preserve">⊘ BLOCKED </w:t>
       </w:r>
       <w:r>
         <w:t>Record controller activation/actuator/parameters/stabilization/saturation</w:t>
@@ -3450,7 +3455,7 @@
         <w:rPr>
           <w:b/>
         </w:rPr>
-        <w:t xml:space="preserve">☐ </w:t>
+        <w:t xml:space="preserve">◐ INCONCLUSIVE </w:t>
       </w:r>
       <w:r>
         <w:t>Measure scheduling latency</w:t>
@@ -3465,7 +3470,7 @@
         <w:rPr>
           <w:b/>
         </w:rPr>
-        <w:t xml:space="preserve">☐ </w:t>
+        <w:t xml:space="preserve">◐ INCONCLUSIVE </w:t>
       </w:r>
       <w:r>
         <w:t>Context-switch overhead</w:t>
@@ -3480,7 +3485,7 @@
         <w:rPr>
           <w:b/>
         </w:rPr>
-        <w:t xml:space="preserve">☐ </w:t>
+        <w:t xml:space="preserve">◐ INCONCLUSIVE </w:t>
       </w:r>
       <w:r>
         <w:t>Decision latency</w:t>
@@ -3495,7 +3500,7 @@
         <w:rPr>
           <w:b/>
         </w:rPr>
-        <w:t xml:space="preserve">☐ </w:t>
+        <w:t xml:space="preserve">⊘ BLOCKED </w:t>
       </w:r>
       <w:r>
         <w:t>Prediction computation cost</w:t>
@@ -3510,7 +3515,7 @@
         <w:rPr>
           <w:b/>
         </w:rPr>
-        <w:t xml:space="preserve">☐ </w:t>
+        <w:t xml:space="preserve">⊘ BLOCKED </w:t>
       </w:r>
       <w:r>
         <w:t>Signal Bus cost</w:t>
@@ -3525,7 +3530,7 @@
         <w:rPr>
           <w:b/>
         </w:rPr>
-        <w:t xml:space="preserve">☐ </w:t>
+        <w:t xml:space="preserve">⊘ BLOCKED </w:t>
       </w:r>
       <w:r>
         <w:t>HMAC/integrity verification cost</w:t>
@@ -3540,7 +3545,7 @@
         <w:rPr>
           <w:b/>
         </w:rPr>
-        <w:t xml:space="preserve">☐ </w:t>
+        <w:t xml:space="preserve">⊘ BLOCKED </w:t>
       </w:r>
       <w:r>
         <w:t>Coordination-index cost</w:t>
@@ -3555,7 +3560,7 @@
         <w:rPr>
           <w:b/>
         </w:rPr>
-        <w:t xml:space="preserve">☐ </w:t>
+        <w:t xml:space="preserve">⊘ BLOCKED </w:t>
       </w:r>
       <w:r>
         <w:t>Controller cost</w:t>
@@ -3570,7 +3575,7 @@
         <w:rPr>
           <w:b/>
         </w:rPr>
-        <w:t xml:space="preserve">☐ </w:t>
+        <w:t xml:space="preserve">⊘ BLOCKED </w:t>
       </w:r>
       <w:r>
         <w:t>Adaptive-policy cost</w:t>
@@ -3585,7 +3590,7 @@
         <w:rPr>
           <w:b/>
         </w:rPr>
-        <w:t xml:space="preserve">☐ </w:t>
+        <w:t xml:space="preserve">◐ INCONCLUSIVE </w:t>
       </w:r>
       <w:r>
         <w:t>Monitoring cost</w:t>
@@ -3600,7 +3605,7 @@
         <w:rPr>
           <w:b/>
         </w:rPr>
-        <w:t xml:space="preserve">☐ </w:t>
+        <w:t xml:space="preserve">◐ INCONCLUSIVE </w:t>
       </w:r>
       <w:r>
         <w:t>Measure CPU overhead</w:t>
@@ -3615,7 +3620,7 @@
         <w:rPr>
           <w:b/>
         </w:rPr>
-        <w:t xml:space="preserve">☐ </w:t>
+        <w:t xml:space="preserve">◐ INCONCLUSIVE </w:t>
       </w:r>
       <w:r>
         <w:t>Memory overhead</w:t>
@@ -3630,7 +3635,7 @@
         <w:rPr>
           <w:b/>
         </w:rPr>
-        <w:t xml:space="preserve">☐ </w:t>
+        <w:t xml:space="preserve">◐ INCONCLUSIVE </w:t>
       </w:r>
       <w:r>
         <w:t>Kernel memory footprint</w:t>
@@ -3645,7 +3650,7 @@
         <w:rPr>
           <w:b/>
         </w:rPr>
-        <w:t xml:space="preserve">☐ </w:t>
+        <w:t xml:space="preserve">⊘ BLOCKED </w:t>
       </w:r>
       <w:r>
         <w:t>Cache misses/hit rate</w:t>
@@ -3660,7 +3665,7 @@
         <w:rPr>
           <w:b/>
         </w:rPr>
-        <w:t xml:space="preserve">☐ </w:t>
+        <w:t xml:space="preserve">⊘ BLOCKED </w:t>
       </w:r>
       <w:r>
         <w:t>Lock contention</w:t>
@@ -3675,7 +3680,7 @@
         <w:rPr>
           <w:b/>
         </w:rPr>
-        <w:t xml:space="preserve">☐ </w:t>
+        <w:t xml:space="preserve">⊘ BLOCKED </w:t>
       </w:r>
       <w:r>
         <w:t>Synchronization overhead</w:t>
@@ -3690,7 +3695,7 @@
         <w:rPr>
           <w:b/>
         </w:rPr>
-        <w:t xml:space="preserve">☐ </w:t>
+        <w:t xml:space="preserve">⊘ BLOCKED </w:t>
       </w:r>
       <w:r>
         <w:t>Inter-CPU communication overhead</w:t>
@@ -3717,7 +3722,7 @@
         <w:rPr>
           <w:b/>
         </w:rPr>
-        <w:t xml:space="preserve">☐ </w:t>
+        <w:t xml:space="preserve">☑ PASS </w:t>
       </w:r>
       <w:r>
         <w:t>CPU: single CPU-bound process</w:t>
@@ -3732,7 +3737,7 @@
         <w:rPr>
           <w:b/>
         </w:rPr>
-        <w:t xml:space="preserve">☐ </w:t>
+        <w:t xml:space="preserve">☑ PASS </w:t>
       </w:r>
       <w:r>
         <w:t>CPU: multiple CPU-bound processes</w:t>
@@ -3747,7 +3752,7 @@
         <w:rPr>
           <w:b/>
         </w:rPr>
-        <w:t xml:space="preserve">☐ </w:t>
+        <w:t xml:space="preserve">☑ PASS </w:t>
       </w:r>
       <w:r>
         <w:t>CPU: under-subscribed</w:t>
@@ -3762,7 +3767,7 @@
         <w:rPr>
           <w:b/>
         </w:rPr>
-        <w:t xml:space="preserve">☐ </w:t>
+        <w:t xml:space="preserve">☑ PASS </w:t>
       </w:r>
       <w:r>
         <w:t>CPU: equal to CPU count</w:t>
@@ -3777,7 +3782,7 @@
         <w:rPr>
           <w:b/>
         </w:rPr>
-        <w:t xml:space="preserve">☐ </w:t>
+        <w:t xml:space="preserve">— N/A </w:t>
       </w:r>
       <w:r>
         <w:t>CPU: over-subscribed</w:t>
@@ -3792,7 +3797,7 @@
         <w:rPr>
           <w:b/>
         </w:rPr>
-        <w:t xml:space="preserve">☐ </w:t>
+        <w:t xml:space="preserve">⊘ BLOCKED </w:t>
       </w:r>
       <w:r>
         <w:t>CPU: bursty</w:t>
@@ -3807,7 +3812,7 @@
         <w:rPr>
           <w:b/>
         </w:rPr>
-        <w:t xml:space="preserve">☐ </w:t>
+        <w:t xml:space="preserve">☑ PASS </w:t>
       </w:r>
       <w:r>
         <w:t>Memory: sequential</w:t>
@@ -3822,7 +3827,7 @@
         <w:rPr>
           <w:b/>
         </w:rPr>
-        <w:t xml:space="preserve">☐ </w:t>
+        <w:t xml:space="preserve">☑ PASS </w:t>
       </w:r>
       <w:r>
         <w:t>Memory: random</w:t>
@@ -3837,7 +3842,7 @@
         <w:rPr>
           <w:b/>
         </w:rPr>
-        <w:t xml:space="preserve">☐ </w:t>
+        <w:t xml:space="preserve">☑ PASS </w:t>
       </w:r>
       <w:r>
         <w:t>Memory: high pressure</w:t>
@@ -3852,7 +3857,7 @@
         <w:rPr>
           <w:b/>
         </w:rPr>
-        <w:t xml:space="preserve">☐ </w:t>
+        <w:t xml:space="preserve">⊘ BLOCKED </w:t>
       </w:r>
       <w:r>
         <w:t>Memory: near exhaustion</w:t>
@@ -3867,7 +3872,7 @@
         <w:rPr>
           <w:b/>
         </w:rPr>
-        <w:t xml:space="preserve">☐ </w:t>
+        <w:t xml:space="preserve">☑ PASS </w:t>
       </w:r>
       <w:r>
         <w:t>Memory: multiple workers</w:t>
@@ -3882,7 +3887,7 @@
         <w:rPr>
           <w:b/>
         </w:rPr>
-        <w:t xml:space="preserve">☐ </w:t>
+        <w:t xml:space="preserve">☑ PASS </w:t>
       </w:r>
       <w:r>
         <w:t>I/O: sequential read/write</w:t>
@@ -3897,7 +3902,7 @@
         <w:rPr>
           <w:b/>
         </w:rPr>
-        <w:t xml:space="preserve">☐ </w:t>
+        <w:t xml:space="preserve">☑ PASS </w:t>
       </w:r>
       <w:r>
         <w:t>I/O: random read/write</w:t>
@@ -3912,7 +3917,7 @@
         <w:rPr>
           <w:b/>
         </w:rPr>
-        <w:t xml:space="preserve">☐ </w:t>
+        <w:t xml:space="preserve">☑ PASS </w:t>
       </w:r>
       <w:r>
         <w:t>I/O: multiple workers</w:t>
@@ -3927,7 +3932,7 @@
         <w:rPr>
           <w:b/>
         </w:rPr>
-        <w:t xml:space="preserve">☐ </w:t>
+        <w:t xml:space="preserve">☑ PASS </w:t>
       </w:r>
       <w:r>
         <w:t>I/O: read-heavy</w:t>
@@ -3942,7 +3947,7 @@
         <w:rPr>
           <w:b/>
         </w:rPr>
-        <w:t xml:space="preserve">☐ </w:t>
+        <w:t xml:space="preserve">☑ PASS </w:t>
       </w:r>
       <w:r>
         <w:t>I/O: write-heavy</w:t>
@@ -3957,7 +3962,7 @@
         <w:rPr>
           <w:b/>
         </w:rPr>
-        <w:t xml:space="preserve">☐ </w:t>
+        <w:t xml:space="preserve">☑ PASS </w:t>
       </w:r>
       <w:r>
         <w:t>I/O: mixed</w:t>
@@ -3972,7 +3977,7 @@
         <w:rPr>
           <w:b/>
         </w:rPr>
-        <w:t xml:space="preserve">☐ </w:t>
+        <w:t xml:space="preserve">⊘ BLOCKED </w:t>
       </w:r>
       <w:r>
         <w:t>Network: high throughput</w:t>
@@ -3987,7 +3992,7 @@
         <w:rPr>
           <w:b/>
         </w:rPr>
-        <w:t xml:space="preserve">☐ </w:t>
+        <w:t xml:space="preserve">⊘ BLOCKED </w:t>
       </w:r>
       <w:r>
         <w:t>Network: high packet rate</w:t>
@@ -4002,7 +4007,7 @@
         <w:rPr>
           <w:b/>
         </w:rPr>
-        <w:t xml:space="preserve">☐ </w:t>
+        <w:t xml:space="preserve">⊘ BLOCKED </w:t>
       </w:r>
       <w:r>
         <w:t>Network: multiple processes</w:t>
@@ -4017,7 +4022,7 @@
         <w:rPr>
           <w:b/>
         </w:rPr>
-        <w:t xml:space="preserve">☐ </w:t>
+        <w:t xml:space="preserve">⊘ BLOCKED </w:t>
       </w:r>
       <w:r>
         <w:t>Network: bursty</w:t>
@@ -4032,7 +4037,7 @@
         <w:rPr>
           <w:b/>
         </w:rPr>
-        <w:t xml:space="preserve">☐ </w:t>
+        <w:t xml:space="preserve">⊘ BLOCKED </w:t>
       </w:r>
       <w:r>
         <w:t>Network: mixed CPU/network</w:t>
@@ -4047,7 +4052,7 @@
         <w:rPr>
           <w:b/>
         </w:rPr>
-        <w:t xml:space="preserve">☐ </w:t>
+        <w:t xml:space="preserve">☑ PASS </w:t>
       </w:r>
       <w:r>
         <w:t>Mixed: CPU+memory</w:t>
@@ -4062,7 +4067,7 @@
         <w:rPr>
           <w:b/>
         </w:rPr>
-        <w:t xml:space="preserve">☐ </w:t>
+        <w:t xml:space="preserve">☑ PASS </w:t>
       </w:r>
       <w:r>
         <w:t>CPU+I/O</w:t>
@@ -4077,7 +4082,7 @@
         <w:rPr>
           <w:b/>
         </w:rPr>
-        <w:t xml:space="preserve">☐ </w:t>
+        <w:t xml:space="preserve">⊘ BLOCKED </w:t>
       </w:r>
       <w:r>
         <w:t>CPU+network</w:t>
@@ -4092,7 +4097,7 @@
         <w:rPr>
           <w:b/>
         </w:rPr>
-        <w:t xml:space="preserve">☐ </w:t>
+        <w:t xml:space="preserve">☑ PASS </w:t>
       </w:r>
       <w:r>
         <w:t>memory+I/O</w:t>
@@ -4107,7 +4112,7 @@
         <w:rPr>
           <w:b/>
         </w:rPr>
-        <w:t xml:space="preserve">☐ </w:t>
+        <w:t xml:space="preserve">☑ PASS </w:t>
       </w:r>
       <w:r>
         <w:t>CPU+memory+I/O</w:t>
@@ -4122,7 +4127,7 @@
         <w:rPr>
           <w:b/>
         </w:rPr>
-        <w:t xml:space="preserve">☐ </w:t>
+        <w:t xml:space="preserve">⊘ BLOCKED </w:t>
       </w:r>
       <w:r>
         <w:t>CPU+memory+network</w:t>
@@ -4137,7 +4142,7 @@
         <w:rPr>
           <w:b/>
         </w:rPr>
-        <w:t xml:space="preserve">☐ </w:t>
+        <w:t xml:space="preserve">☑ PASS </w:t>
       </w:r>
       <w:r>
         <w:t>full mixed workload</w:t>
@@ -4164,7 +4169,7 @@
         <w:rPr>
           <w:b/>
         </w:rPr>
-        <w:t xml:space="preserve">☐ </w:t>
+        <w:t xml:space="preserve">⊘ BLOCKED </w:t>
       </w:r>
       <w:r>
         <w:t>Stable workload</w:t>
@@ -4179,7 +4184,7 @@
         <w:rPr>
           <w:b/>
         </w:rPr>
-        <w:t xml:space="preserve">☐ </w:t>
+        <w:t xml:space="preserve">⊘ BLOCKED </w:t>
       </w:r>
       <w:r>
         <w:t>Gradually increasing load</w:t>
@@ -4194,7 +4199,7 @@
         <w:rPr>
           <w:b/>
         </w:rPr>
-        <w:t xml:space="preserve">☐ </w:t>
+        <w:t xml:space="preserve">⊘ BLOCKED </w:t>
       </w:r>
       <w:r>
         <w:t>Gradually decreasing load</w:t>
@@ -4209,7 +4214,7 @@
         <w:rPr>
           <w:b/>
         </w:rPr>
-        <w:t xml:space="preserve">☐ </w:t>
+        <w:t xml:space="preserve">⊘ BLOCKED </w:t>
       </w:r>
       <w:r>
         <w:t>Sudden load spike</w:t>
@@ -4224,7 +4229,7 @@
         <w:rPr>
           <w:b/>
         </w:rPr>
-        <w:t xml:space="preserve">☐ </w:t>
+        <w:t xml:space="preserve">⊘ BLOCKED </w:t>
       </w:r>
       <w:r>
         <w:t>Sudden load collapse</w:t>
@@ -4239,7 +4244,7 @@
         <w:rPr>
           <w:b/>
         </w:rPr>
-        <w:t xml:space="preserve">☐ </w:t>
+        <w:t xml:space="preserve">⊘ BLOCKED </w:t>
       </w:r>
       <w:r>
         <w:t>Periodic workload</w:t>
@@ -4254,7 +4259,7 @@
         <w:rPr>
           <w:b/>
         </w:rPr>
-        <w:t xml:space="preserve">☐ </w:t>
+        <w:t xml:space="preserve">⊘ BLOCKED </w:t>
       </w:r>
       <w:r>
         <w:t>Alternating workload</w:t>
@@ -4269,7 +4274,7 @@
         <w:rPr>
           <w:b/>
         </w:rPr>
-        <w:t xml:space="preserve">☐ </w:t>
+        <w:t xml:space="preserve">⊘ BLOCKED </w:t>
       </w:r>
       <w:r>
         <w:t>Random workload</w:t>
@@ -4284,7 +4289,7 @@
         <w:rPr>
           <w:b/>
         </w:rPr>
-        <w:t xml:space="preserve">☐ </w:t>
+        <w:t xml:space="preserve">⊘ BLOCKED </w:t>
       </w:r>
       <w:r>
         <w:t>Bursty workload</w:t>
@@ -4299,7 +4304,7 @@
         <w:rPr>
           <w:b/>
         </w:rPr>
-        <w:t xml:space="preserve">☐ </w:t>
+        <w:t xml:space="preserve">⊘ BLOCKED </w:t>
       </w:r>
       <w:r>
         <w:t>Multiple simultaneous transitions</w:t>
@@ -4314,7 +4319,7 @@
         <w:rPr>
           <w:b/>
         </w:rPr>
-        <w:t xml:space="preserve">☐ </w:t>
+        <w:t xml:space="preserve">⊘ BLOCKED </w:t>
       </w:r>
       <w:r>
         <w:t>Workload migration between CPUs</w:t>
@@ -4329,7 +4334,7 @@
         <w:rPr>
           <w:b/>
         </w:rPr>
-        <w:t xml:space="preserve">☐ </w:t>
+        <w:t xml:space="preserve">⊘ BLOCKED </w:t>
       </w:r>
       <w:r>
         <w:t>For every dynamic case record prediction accuracy, response latency, Q, CPU utilization, throughput, migration rate, oscillation rate and recovery time</w:t>
@@ -4356,7 +4361,7 @@
         <w:rPr>
           <w:b/>
         </w:rPr>
-        <w:t xml:space="preserve">☐ </w:t>
+        <w:t xml:space="preserve">◐ INCONCLUSIVE </w:t>
       </w:r>
       <w:r>
         <w:t>CPU at 50%</w:t>
@@ -4371,7 +4376,7 @@
         <w:rPr>
           <w:b/>
         </w:rPr>
-        <w:t xml:space="preserve">☐ </w:t>
+        <w:t xml:space="preserve">◐ INCONCLUSIVE </w:t>
       </w:r>
       <w:r>
         <w:t>70%</w:t>
@@ -4386,7 +4391,7 @@
         <w:rPr>
           <w:b/>
         </w:rPr>
-        <w:t xml:space="preserve">☐ </w:t>
+        <w:t xml:space="preserve">◐ INCONCLUSIVE </w:t>
       </w:r>
       <w:r>
         <w:t>80%</w:t>
@@ -4401,7 +4406,7 @@
         <w:rPr>
           <w:b/>
         </w:rPr>
-        <w:t xml:space="preserve">☐ </w:t>
+        <w:t xml:space="preserve">◐ INCONCLUSIVE </w:t>
       </w:r>
       <w:r>
         <w:t>90%</w:t>
@@ -4416,7 +4421,7 @@
         <w:rPr>
           <w:b/>
         </w:rPr>
-        <w:t xml:space="preserve">☐ </w:t>
+        <w:t xml:space="preserve">◐ INCONCLUSIVE </w:t>
       </w:r>
       <w:r>
         <w:t>95%</w:t>
@@ -4431,7 +4436,7 @@
         <w:rPr>
           <w:b/>
         </w:rPr>
-        <w:t xml:space="preserve">☐ </w:t>
+        <w:t xml:space="preserve">☑ PASS </w:t>
       </w:r>
       <w:r>
         <w:t>near saturation</w:t>
@@ -4446,7 +4451,7 @@
         <w:rPr>
           <w:b/>
         </w:rPr>
-        <w:t xml:space="preserve">☐ </w:t>
+        <w:t xml:space="preserve">☑ PASS </w:t>
       </w:r>
       <w:r>
         <w:t>full saturation</w:t>
@@ -4461,7 +4466,7 @@
         <w:rPr>
           <w:b/>
         </w:rPr>
-        <w:t xml:space="preserve">☐ </w:t>
+        <w:t xml:space="preserve">☑ PASS </w:t>
       </w:r>
       <w:r>
         <w:t>Moderate memory pressure</w:t>
@@ -4476,7 +4481,7 @@
         <w:rPr>
           <w:b/>
         </w:rPr>
-        <w:t xml:space="preserve">☐ </w:t>
+        <w:t xml:space="preserve">☑ PASS </w:t>
       </w:r>
       <w:r>
         <w:t>High memory pressure</w:t>
@@ -4491,7 +4496,7 @@
         <w:rPr>
           <w:b/>
         </w:rPr>
-        <w:t xml:space="preserve">☐ </w:t>
+        <w:t xml:space="preserve">⊘ BLOCKED </w:t>
       </w:r>
       <w:r>
         <w:t>Near exhaustion</w:t>
@@ -4506,7 +4511,7 @@
         <w:rPr>
           <w:b/>
         </w:rPr>
-        <w:t xml:space="preserve">☐ </w:t>
+        <w:t xml:space="preserve">☑ PASS </w:t>
       </w:r>
       <w:r>
         <w:t>Concurrent memory workers</w:t>
@@ -4521,7 +4526,7 @@
         <w:rPr>
           <w:b/>
         </w:rPr>
-        <w:t xml:space="preserve">☐ </w:t>
+        <w:t xml:space="preserve">◐ INCONCLUSIVE </w:t>
       </w:r>
       <w:r>
         <w:t>One CPU heavily loaded</w:t>
@@ -4536,7 +4541,7 @@
         <w:rPr>
           <w:b/>
         </w:rPr>
-        <w:t xml:space="preserve">☐ </w:t>
+        <w:t xml:space="preserve">◐ INCONCLUSIVE </w:t>
       </w:r>
       <w:r>
         <w:t>Half CPUs heavily loaded</w:t>
@@ -4551,7 +4556,7 @@
         <w:rPr>
           <w:b/>
         </w:rPr>
-        <w:t xml:space="preserve">☐ </w:t>
+        <w:t xml:space="preserve">◐ INCONCLUSIVE </w:t>
       </w:r>
       <w:r>
         <w:t>Uneven workload distribution</w:t>
@@ -4566,7 +4571,7 @@
         <w:rPr>
           <w:b/>
         </w:rPr>
-        <w:t xml:space="preserve">☐ </w:t>
+        <w:t xml:space="preserve">◐ INCONCLUSIVE </w:t>
       </w:r>
       <w:r>
         <w:t>Forced affinity imbalance</w:t>
@@ -4581,7 +4586,7 @@
         <w:rPr>
           <w:b/>
         </w:rPr>
-        <w:t xml:space="preserve">☐ </w:t>
+        <w:t xml:space="preserve">✗ FAIL </w:t>
       </w:r>
       <w:r>
         <w:t>Migration pressure</w:t>
@@ -4596,7 +4601,7 @@
         <w:rPr>
           <w:b/>
         </w:rPr>
-        <w:t xml:space="preserve">☐ </w:t>
+        <w:t xml:space="preserve">☑ PASS </w:t>
       </w:r>
       <w:r>
         <w:t>Normal temperature</w:t>
@@ -4611,7 +4616,7 @@
         <w:rPr>
           <w:b/>
         </w:rPr>
-        <w:t xml:space="preserve">☐ </w:t>
+        <w:t xml:space="preserve">☑ PASS </w:t>
       </w:r>
       <w:r>
         <w:t>Elevated temperature</w:t>
@@ -4626,7 +4631,7 @@
         <w:rPr>
           <w:b/>
         </w:rPr>
-        <w:t xml:space="preserve">☐ </w:t>
+        <w:t xml:space="preserve">☑ PASS </w:t>
       </w:r>
       <w:r>
         <w:t>Sustained high temperature</w:t>
@@ -4641,7 +4646,7 @@
         <w:rPr>
           <w:b/>
         </w:rPr>
-        <w:t xml:space="preserve">☐ </w:t>
+        <w:t xml:space="preserve">⊘ BLOCKED </w:t>
       </w:r>
       <w:r>
         <w:t>Safely reproducible thermal-throttling condition</w:t>
@@ -4656,7 +4661,7 @@
         <w:rPr>
           <w:b/>
         </w:rPr>
-        <w:t xml:space="preserve">☐ </w:t>
+        <w:t xml:space="preserve">⊘ BLOCKED </w:t>
       </w:r>
       <w:r>
         <w:t>10-minute run</w:t>
@@ -4671,7 +4676,7 @@
         <w:rPr>
           <w:b/>
         </w:rPr>
-        <w:t xml:space="preserve">☐ </w:t>
+        <w:t xml:space="preserve">⊘ BLOCKED </w:t>
       </w:r>
       <w:r>
         <w:t>30-minute run</w:t>
@@ -4686,7 +4691,7 @@
         <w:rPr>
           <w:b/>
         </w:rPr>
-        <w:t xml:space="preserve">☐ </w:t>
+        <w:t xml:space="preserve">⊘ BLOCKED </w:t>
       </w:r>
       <w:r>
         <w:t>1-hour run</w:t>
@@ -4701,7 +4706,7 @@
         <w:rPr>
           <w:b/>
         </w:rPr>
-        <w:t xml:space="preserve">☐ </w:t>
+        <w:t xml:space="preserve">⊘ BLOCKED </w:t>
       </w:r>
       <w:r>
         <w:t>Multi-hour run</w:t>
@@ -4716,7 +4721,7 @@
         <w:rPr>
           <w:b/>
         </w:rPr>
-        <w:t xml:space="preserve">☐ </w:t>
+        <w:t xml:space="preserve">⊘ BLOCKED </w:t>
       </w:r>
       <w:r>
         <w:t>Overnight run if practical</w:t>
@@ -4731,7 +4736,7 @@
         <w:rPr>
           <w:b/>
         </w:rPr>
-        <w:t xml:space="preserve">☐ </w:t>
+        <w:t xml:space="preserve">◐ INCONCLUSIVE </w:t>
       </w:r>
       <w:r>
         <w:t>Check memory leaks</w:t>
@@ -4746,7 +4751,7 @@
         <w:rPr>
           <w:b/>
         </w:rPr>
-        <w:t xml:space="preserve">☐ </w:t>
+        <w:t xml:space="preserve">◐ INCONCLUSIVE </w:t>
       </w:r>
       <w:r>
         <w:t>CPU-overhead drift</w:t>
@@ -4761,7 +4766,7 @@
         <w:rPr>
           <w:b/>
         </w:rPr>
-        <w:t xml:space="preserve">☐ </w:t>
+        <w:t xml:space="preserve">⊘ BLOCKED </w:t>
       </w:r>
       <w:r>
         <w:t>Q degradation</w:t>
@@ -4776,7 +4781,7 @@
         <w:rPr>
           <w:b/>
         </w:rPr>
-        <w:t xml:space="preserve">☐ </w:t>
+        <w:t xml:space="preserve">⊘ BLOCKED </w:t>
       </w:r>
       <w:r>
         <w:t>Predictor degradation</w:t>
@@ -4791,7 +4796,7 @@
         <w:rPr>
           <w:b/>
         </w:rPr>
-        <w:t xml:space="preserve">☐ </w:t>
+        <w:t xml:space="preserve">⊘ BLOCKED </w:t>
       </w:r>
       <w:r>
         <w:t>Controller drift</w:t>
@@ -4806,7 +4811,7 @@
         <w:rPr>
           <w:b/>
         </w:rPr>
-        <w:t xml:space="preserve">☐ </w:t>
+        <w:t xml:space="preserve">☑ PASS </w:t>
       </w:r>
       <w:r>
         <w:t>scheduler instability</w:t>
@@ -4821,7 +4826,7 @@
         <w:rPr>
           <w:b/>
         </w:rPr>
-        <w:t xml:space="preserve">☐ </w:t>
+        <w:t xml:space="preserve">◐ INCONCLUSIVE </w:t>
       </w:r>
       <w:r>
         <w:t>log-buffer exhaustion</w:t>
@@ -4836,7 +4841,7 @@
         <w:rPr>
           <w:b/>
         </w:rPr>
-        <w:t xml:space="preserve">☐ </w:t>
+        <w:t xml:space="preserve">☑ PASS </w:t>
       </w:r>
       <w:r>
         <w:t>resource exhaustion</w:t>
@@ -4863,7 +4868,7 @@
         <w:rPr>
           <w:b/>
         </w:rPr>
-        <w:t xml:space="preserve">☐ </w:t>
+        <w:t xml:space="preserve">⊘ BLOCKED </w:t>
       </w:r>
       <w:r>
         <w:t>Create many eligible processes with similar observed state</w:t>
@@ -4878,7 +4883,7 @@
         <w:rPr>
           <w:b/>
         </w:rPr>
-        <w:t xml:space="preserve">☐ </w:t>
+        <w:t xml:space="preserve">⊘ BLOCKED </w:t>
       </w:r>
       <w:r>
         <w:t>Induce common threshold crossing</w:t>
@@ -4893,7 +4898,7 @@
         <w:rPr>
           <w:b/>
         </w:rPr>
-        <w:t xml:space="preserve">☐ </w:t>
+        <w:t xml:space="preserve">⊘ BLOCKED </w:t>
       </w:r>
       <w:r>
         <w:t>Induce common CPU-load change</w:t>
@@ -4908,7 +4913,7 @@
         <w:rPr>
           <w:b/>
         </w:rPr>
-        <w:t xml:space="preserve">☐ </w:t>
+        <w:t xml:space="preserve">⊘ BLOCKED </w:t>
       </w:r>
       <w:r>
         <w:t>Induce common predicted-state transition</w:t>
@@ -4923,7 +4928,7 @@
         <w:rPr>
           <w:b/>
         </w:rPr>
-        <w:t xml:space="preserve">☐ </w:t>
+        <w:t xml:space="preserve">⊘ BLOCKED </w:t>
       </w:r>
       <w:r>
         <w:t>Induce common directive</w:t>
@@ -4938,7 +4943,7 @@
         <w:rPr>
           <w:b/>
         </w:rPr>
-        <w:t xml:space="preserve">☐ </w:t>
+        <w:t xml:space="preserve">⊘ BLOCKED </w:t>
       </w:r>
       <w:r>
         <w:t>Measure simultaneous action changes</w:t>
@@ -4953,7 +4958,7 @@
         <w:rPr>
           <w:b/>
         </w:rPr>
-        <w:t xml:space="preserve">☐ </w:t>
+        <w:t xml:space="preserve">⊘ BLOCKED </w:t>
       </w:r>
       <w:r>
         <w:t>Measure migration bursts</w:t>
@@ -4968,7 +4973,7 @@
         <w:rPr>
           <w:b/>
         </w:rPr>
-        <w:t xml:space="preserve">☐ </w:t>
+        <w:t xml:space="preserve">⊘ BLOCKED </w:t>
       </w:r>
       <w:r>
         <w:t>Measure wake-up bursts</w:t>
@@ -4983,7 +4988,7 @@
         <w:rPr>
           <w:b/>
         </w:rPr>
-        <w:t xml:space="preserve">☐ </w:t>
+        <w:t xml:space="preserve">⊘ BLOCKED </w:t>
       </w:r>
       <w:r>
         <w:t>Measure CPU-utilization oscillation</w:t>
@@ -4998,7 +5003,7 @@
         <w:rPr>
           <w:b/>
         </w:rPr>
-        <w:t xml:space="preserve">☐ </w:t>
+        <w:t xml:space="preserve">⊘ BLOCKED </w:t>
       </w:r>
       <w:r>
         <w:t>Measure queue oscillation</w:t>
@@ -5013,7 +5018,7 @@
         <w:rPr>
           <w:b/>
         </w:rPr>
-        <w:t xml:space="preserve">☐ </w:t>
+        <w:t xml:space="preserve">⊘ BLOCKED </w:t>
       </w:r>
       <w:r>
         <w:t>Measure S3</w:t>
@@ -5028,7 +5033,7 @@
         <w:rPr>
           <w:b/>
         </w:rPr>
-        <w:t xml:space="preserve">☐ </w:t>
+        <w:t xml:space="preserve">⊘ BLOCKED </w:t>
       </w:r>
       <w:r>
         <w:t>Measure S4</w:t>
@@ -5043,7 +5048,7 @@
         <w:rPr>
           <w:b/>
         </w:rPr>
-        <w:t xml:space="preserve">☐ </w:t>
+        <w:t xml:space="preserve">⊘ BLOCKED </w:t>
       </w:r>
       <w:r>
         <w:t>Measure Q</w:t>
@@ -5058,7 +5063,7 @@
         <w:rPr>
           <w:b/>
         </w:rPr>
-        <w:t xml:space="preserve">☐ </w:t>
+        <w:t xml:space="preserve">⊘ BLOCKED </w:t>
       </w:r>
       <w:r>
         <w:t>Measure recovery time</w:t>
@@ -5073,7 +5078,7 @@
         <w:rPr>
           <w:b/>
         </w:rPr>
-        <w:t xml:space="preserve">☐ </w:t>
+        <w:t xml:space="preserve">⊘ BLOCKED </w:t>
       </w:r>
       <w:r>
         <w:t>Compare Linux baseline vs ORCHESTRA without anti-synchronization vs final ORCHESTRA</w:t>
@@ -5100,7 +5105,7 @@
         <w:rPr>
           <w:b/>
         </w:rPr>
-        <w:t xml:space="preserve">☐ </w:t>
+        <w:t xml:space="preserve">⊘ BLOCKED </w:t>
       </w:r>
       <w:r>
         <w:t>Measure CPU share per process</w:t>
@@ -5115,7 +5120,7 @@
         <w:rPr>
           <w:b/>
         </w:rPr>
-        <w:t xml:space="preserve">☐ </w:t>
+        <w:t xml:space="preserve">⊘ BLOCKED </w:t>
       </w:r>
       <w:r>
         <w:t>Measure CPU-share variance</w:t>
@@ -5130,7 +5135,7 @@
         <w:rPr>
           <w:b/>
         </w:rPr>
-        <w:t xml:space="preserve">☐ </w:t>
+        <w:t xml:space="preserve">⊘ BLOCKED </w:t>
       </w:r>
       <w:r>
         <w:t>Calculate fairness metric if adopted</w:t>
@@ -5145,7 +5150,7 @@
         <w:rPr>
           <w:b/>
         </w:rPr>
-        <w:t xml:space="preserve">☐ </w:t>
+        <w:t xml:space="preserve">⊘ BLOCKED </w:t>
       </w:r>
       <w:r>
         <w:t>Measure waiting time</w:t>
@@ -5160,7 +5165,7 @@
         <w:rPr>
           <w:b/>
         </w:rPr>
-        <w:t xml:space="preserve">☐ </w:t>
+        <w:t xml:space="preserve">⊘ BLOCKED </w:t>
       </w:r>
       <w:r>
         <w:t>Measure response time</w:t>
@@ -5175,7 +5180,7 @@
         <w:rPr>
           <w:b/>
         </w:rPr>
-        <w:t xml:space="preserve">☐ </w:t>
+        <w:t xml:space="preserve">⊘ BLOCKED </w:t>
       </w:r>
       <w:r>
         <w:t>Measure completion time</w:t>
@@ -5190,7 +5195,7 @@
         <w:rPr>
           <w:b/>
         </w:rPr>
-        <w:t xml:space="preserve">☐ </w:t>
+        <w:t xml:space="preserve">⊘ BLOCKED </w:t>
       </w:r>
       <w:r>
         <w:t>Detect starvation</w:t>
@@ -5205,7 +5210,7 @@
         <w:rPr>
           <w:b/>
         </w:rPr>
-        <w:t xml:space="preserve">☐ </w:t>
+        <w:t xml:space="preserve">⊘ BLOCKED </w:t>
       </w:r>
       <w:r>
         <w:t>Test long-running task fairness</w:t>
@@ -5220,7 +5225,7 @@
         <w:rPr>
           <w:b/>
         </w:rPr>
-        <w:t xml:space="preserve">☐ </w:t>
+        <w:t xml:space="preserve">⊘ BLOCKED </w:t>
       </w:r>
       <w:r>
         <w:t>Test short-task responsiveness</w:t>
@@ -5235,7 +5240,7 @@
         <w:rPr>
           <w:b/>
         </w:rPr>
-        <w:t xml:space="preserve">☐ </w:t>
+        <w:t xml:space="preserve">⊘ BLOCKED </w:t>
       </w:r>
       <w:r>
         <w:t>Test interactive responsiveness</w:t>
@@ -5250,7 +5255,7 @@
         <w:rPr>
           <w:b/>
         </w:rPr>
-        <w:t xml:space="preserve">☐ </w:t>
+        <w:t xml:space="preserve">⊘ BLOCKED </w:t>
       </w:r>
       <w:r>
         <w:t>Test I/O-bound fairness</w:t>
@@ -5265,7 +5270,7 @@
         <w:rPr>
           <w:b/>
         </w:rPr>
-        <w:t xml:space="preserve">☐ </w:t>
+        <w:t xml:space="preserve">⊘ BLOCKED </w:t>
       </w:r>
       <w:r>
         <w:t>Test CPU-bound fairness</w:t>
@@ -5292,7 +5297,7 @@
         <w:rPr>
           <w:b/>
         </w:rPr>
-        <w:t xml:space="preserve">☐ </w:t>
+        <w:t xml:space="preserve">✗ FAIL </w:t>
       </w:r>
       <w:r>
         <w:t>Single migration</w:t>
@@ -5307,7 +5312,7 @@
         <w:rPr>
           <w:b/>
         </w:rPr>
-        <w:t xml:space="preserve">☐ </w:t>
+        <w:t xml:space="preserve">✗ FAIL </w:t>
       </w:r>
       <w:r>
         <w:t>Repeated migration</w:t>
@@ -5322,7 +5327,7 @@
         <w:rPr>
           <w:b/>
         </w:rPr>
-        <w:t xml:space="preserve">☐ </w:t>
+        <w:t xml:space="preserve">✗ FAIL </w:t>
       </w:r>
       <w:r>
         <w:t>Multiple-process migration</w:t>
@@ -5337,7 +5342,7 @@
         <w:rPr>
           <w:b/>
         </w:rPr>
-        <w:t xml:space="preserve">☐ </w:t>
+        <w:t xml:space="preserve">✗ FAIL </w:t>
       </w:r>
       <w:r>
         <w:t>Cross-core migration</w:t>
@@ -5352,7 +5357,7 @@
         <w:rPr>
           <w:b/>
         </w:rPr>
-        <w:t xml:space="preserve">☐ </w:t>
+        <w:t xml:space="preserve">— N/A </w:t>
       </w:r>
       <w:r>
         <w:t>Cross-socket migration</w:t>
@@ -5367,7 +5372,7 @@
         <w:rPr>
           <w:b/>
         </w:rPr>
-        <w:t xml:space="preserve">☐ </w:t>
+        <w:t xml:space="preserve">— N/A </w:t>
       </w:r>
       <w:r>
         <w:t>NUMA migration</w:t>
@@ -5382,7 +5387,7 @@
         <w:rPr>
           <w:b/>
         </w:rPr>
-        <w:t xml:space="preserve">☐ </w:t>
+        <w:t xml:space="preserve">✗ FAIL </w:t>
       </w:r>
       <w:r>
         <w:t>Migration under CPU saturation</w:t>
@@ -5397,7 +5402,7 @@
         <w:rPr>
           <w:b/>
         </w:rPr>
-        <w:t xml:space="preserve">☐ </w:t>
+        <w:t xml:space="preserve">✗ FAIL </w:t>
       </w:r>
       <w:r>
         <w:t>Migration under memory pressure</w:t>
@@ -5412,7 +5417,7 @@
         <w:rPr>
           <w:b/>
         </w:rPr>
-        <w:t xml:space="preserve">☐ </w:t>
+        <w:t xml:space="preserve">✗ FAIL </w:t>
       </w:r>
       <w:r>
         <w:t>Migration under thermal pressure</w:t>
@@ -5427,7 +5432,7 @@
         <w:rPr>
           <w:b/>
         </w:rPr>
-        <w:t xml:space="preserve">☐ </w:t>
+        <w:t xml:space="preserve">◐ INCONCLUSIVE </w:t>
       </w:r>
       <w:r>
         <w:t>Detect migration oscillation</w:t>
@@ -5442,7 +5447,7 @@
         <w:rPr>
           <w:b/>
         </w:rPr>
-        <w:t xml:space="preserve">☐ </w:t>
+        <w:t xml:space="preserve">◐ INCONCLUSIVE </w:t>
       </w:r>
       <w:r>
         <w:t>Measure migration overhead</w:t>
@@ -5457,7 +5462,7 @@
         <w:rPr>
           <w:b/>
         </w:rPr>
-        <w:t xml:space="preserve">☐ </w:t>
+        <w:t xml:space="preserve">⊘ BLOCKED </w:t>
       </w:r>
       <w:r>
         <w:t>Measure cache impact</w:t>
@@ -5472,7 +5477,7 @@
         <w:rPr>
           <w:b/>
         </w:rPr>
-        <w:t xml:space="preserve">☐ </w:t>
+        <w:t xml:space="preserve">— N/A </w:t>
       </w:r>
       <w:r>
         <w:t>Measure NUMA locality impact</w:t>
@@ -5499,7 +5504,7 @@
         <w:rPr>
           <w:b/>
         </w:rPr>
-        <w:t xml:space="preserve">☐ </w:t>
+        <w:t xml:space="preserve">⊘ BLOCKED </w:t>
       </w:r>
       <w:r>
         <w:t>Signal producer failure</w:t>
@@ -5514,7 +5519,7 @@
         <w:rPr>
           <w:b/>
         </w:rPr>
-        <w:t xml:space="preserve">☐ </w:t>
+        <w:t xml:space="preserve">⊘ BLOCKED </w:t>
       </w:r>
       <w:r>
         <w:t>Signal consumer failure</w:t>
@@ -5529,7 +5534,7 @@
         <w:rPr>
           <w:b/>
         </w:rPr>
-        <w:t xml:space="preserve">☐ </w:t>
+        <w:t xml:space="preserve">⊘ BLOCKED </w:t>
       </w:r>
       <w:r>
         <w:t>Signal corruption</w:t>
@@ -5544,7 +5549,7 @@
         <w:rPr>
           <w:b/>
         </w:rPr>
-        <w:t xml:space="preserve">☐ </w:t>
+        <w:t xml:space="preserve">⊘ BLOCKED </w:t>
       </w:r>
       <w:r>
         <w:t>Signal delay</w:t>
@@ -5559,7 +5564,7 @@
         <w:rPr>
           <w:b/>
         </w:rPr>
-        <w:t xml:space="preserve">☐ </w:t>
+        <w:t xml:space="preserve">⊘ BLOCKED </w:t>
       </w:r>
       <w:r>
         <w:t>Signal loss</w:t>
@@ -5574,7 +5579,7 @@
         <w:rPr>
           <w:b/>
         </w:rPr>
-        <w:t xml:space="preserve">☐ </w:t>
+        <w:t xml:space="preserve">⊘ BLOCKED </w:t>
       </w:r>
       <w:r>
         <w:t>Signal recovery</w:t>
@@ -5589,7 +5594,7 @@
         <w:rPr>
           <w:b/>
         </w:rPr>
-        <w:t xml:space="preserve">☐ </w:t>
+        <w:t xml:space="preserve">⊘ BLOCKED </w:t>
       </w:r>
       <w:r>
         <w:t>Predictor unavailable</w:t>
@@ -5604,7 +5609,7 @@
         <w:rPr>
           <w:b/>
         </w:rPr>
-        <w:t xml:space="preserve">☐ </w:t>
+        <w:t xml:space="preserve">⊘ BLOCKED </w:t>
       </w:r>
       <w:r>
         <w:t>Predictor invalid output</w:t>
@@ -5619,7 +5624,7 @@
         <w:rPr>
           <w:b/>
         </w:rPr>
-        <w:t xml:space="preserve">☐ </w:t>
+        <w:t xml:space="preserve">⊘ BLOCKED </w:t>
       </w:r>
       <w:r>
         <w:t>Predictor timeout</w:t>
@@ -5634,7 +5639,7 @@
         <w:rPr>
           <w:b/>
         </w:rPr>
-        <w:t xml:space="preserve">☐ </w:t>
+        <w:t xml:space="preserve">⊘ BLOCKED </w:t>
       </w:r>
       <w:r>
         <w:t>Prediction-confidence collapse</w:t>
@@ -5649,7 +5654,7 @@
         <w:rPr>
           <w:b/>
         </w:rPr>
-        <w:t xml:space="preserve">☐ </w:t>
+        <w:t xml:space="preserve">☑ PASS </w:t>
       </w:r>
       <w:r>
         <w:t>Fallback to observed state</w:t>
@@ -5664,7 +5669,7 @@
         <w:rPr>
           <w:b/>
         </w:rPr>
-        <w:t xml:space="preserve">☐ </w:t>
+        <w:t xml:space="preserve">⊘ BLOCKED </w:t>
       </w:r>
       <w:r>
         <w:t>Predictor recovery</w:t>
@@ -5679,7 +5684,7 @@
         <w:rPr>
           <w:b/>
         </w:rPr>
-        <w:t xml:space="preserve">☐ </w:t>
+        <w:t xml:space="preserve">⊘ BLOCKED </w:t>
       </w:r>
       <w:r>
         <w:t>Policy unavailable</w:t>
@@ -5694,7 +5699,7 @@
         <w:rPr>
           <w:b/>
         </w:rPr>
-        <w:t xml:space="preserve">☐ </w:t>
+        <w:t xml:space="preserve">⊘ BLOCKED </w:t>
       </w:r>
       <w:r>
         <w:t>Invalid policy</w:t>
@@ -5709,7 +5714,7 @@
         <w:rPr>
           <w:b/>
         </w:rPr>
-        <w:t xml:space="preserve">☐ </w:t>
+        <w:t xml:space="preserve">⊘ BLOCKED </w:t>
       </w:r>
       <w:r>
         <w:t>Policy reset</w:t>
@@ -5724,7 +5729,7 @@
         <w:rPr>
           <w:b/>
         </w:rPr>
-        <w:t xml:space="preserve">☐ </w:t>
+        <w:t xml:space="preserve">⊘ BLOCKED </w:t>
       </w:r>
       <w:r>
         <w:t>Policy suspension</w:t>
@@ -5739,7 +5744,7 @@
         <w:rPr>
           <w:b/>
         </w:rPr>
-        <w:t xml:space="preserve">☐ </w:t>
+        <w:t xml:space="preserve">☑ PASS </w:t>
       </w:r>
       <w:r>
         <w:t>Fallback scheduling</w:t>
@@ -5754,7 +5759,7 @@
         <w:rPr>
           <w:b/>
         </w:rPr>
-        <w:t xml:space="preserve">☐ </w:t>
+        <w:t xml:space="preserve">⊘ BLOCKED </w:t>
       </w:r>
       <w:r>
         <w:t>Controller disabled</w:t>
@@ -5769,7 +5774,7 @@
         <w:rPr>
           <w:b/>
         </w:rPr>
-        <w:t xml:space="preserve">☐ </w:t>
+        <w:t xml:space="preserve">⊘ BLOCKED </w:t>
       </w:r>
       <w:r>
         <w:t>Controller saturation</w:t>
@@ -5784,7 +5789,7 @@
         <w:rPr>
           <w:b/>
         </w:rPr>
-        <w:t xml:space="preserve">☐ </w:t>
+        <w:t xml:space="preserve">⊘ BLOCKED </w:t>
       </w:r>
       <w:r>
         <w:t>Invalid parameter update</w:t>
@@ -5799,7 +5804,7 @@
         <w:rPr>
           <w:b/>
         </w:rPr>
-        <w:t xml:space="preserve">☐ </w:t>
+        <w:t xml:space="preserve">⊘ BLOCKED </w:t>
       </w:r>
       <w:r>
         <w:t>Parameter oscillation</w:t>
@@ -5814,7 +5819,7 @@
         <w:rPr>
           <w:b/>
         </w:rPr>
-        <w:t xml:space="preserve">☐ </w:t>
+        <w:t xml:space="preserve">⊘ BLOCKED </w:t>
       </w:r>
       <w:r>
         <w:t>Controller restart</w:t>
@@ -5829,7 +5834,7 @@
         <w:rPr>
           <w:b/>
         </w:rPr>
-        <w:t xml:space="preserve">☐ </w:t>
+        <w:t xml:space="preserve">⊘ BLOCKED </w:t>
       </w:r>
       <w:r>
         <w:t>Controller recovery</w:t>
@@ -5844,7 +5849,7 @@
         <w:rPr>
           <w:b/>
         </w:rPr>
-        <w:t xml:space="preserve">☐ </w:t>
+        <w:t xml:space="preserve">⊘ BLOCKED </w:t>
       </w:r>
       <w:r>
         <w:t>CPU offline/online where supported</w:t>
@@ -5859,7 +5864,7 @@
         <w:rPr>
           <w:b/>
         </w:rPr>
-        <w:t xml:space="preserve">☐ </w:t>
+        <w:t xml:space="preserve">☑ PASS </w:t>
       </w:r>
       <w:r>
         <w:t>Process termination during scheduling</w:t>
@@ -5874,7 +5879,7 @@
         <w:rPr>
           <w:b/>
         </w:rPr>
-        <w:t xml:space="preserve">☐ </w:t>
+        <w:t xml:space="preserve">☑ PASS </w:t>
       </w:r>
       <w:r>
         <w:t>Process creation during load</w:t>
@@ -5889,7 +5894,7 @@
         <w:rPr>
           <w:b/>
         </w:rPr>
-        <w:t xml:space="preserve">☐ </w:t>
+        <w:t xml:space="preserve">⊘ BLOCKED </w:t>
       </w:r>
       <w:r>
         <w:t>CPU hotplug where supported</w:t>
@@ -5904,7 +5909,7 @@
         <w:rPr>
           <w:b/>
         </w:rPr>
-        <w:t xml:space="preserve">☐ </w:t>
+        <w:t xml:space="preserve">☑ PASS </w:t>
       </w:r>
       <w:r>
         <w:t>Memory pressure</w:t>
@@ -5919,7 +5924,7 @@
         <w:rPr>
           <w:b/>
         </w:rPr>
-        <w:t xml:space="preserve">☐ </w:t>
+        <w:t xml:space="preserve">☑ PASS </w:t>
       </w:r>
       <w:r>
         <w:t>Safe scheduler recovery</w:t>
@@ -5946,7 +5951,7 @@
         <w:rPr>
           <w:b/>
         </w:rPr>
-        <w:t xml:space="preserve">☐ </w:t>
+        <w:t xml:space="preserve">☑ PASS </w:t>
       </w:r>
       <w:r>
         <w:t>Tamper signal</w:t>
@@ -5961,7 +5966,7 @@
         <w:rPr>
           <w:b/>
         </w:rPr>
-        <w:t xml:space="preserve">☐ </w:t>
+        <w:t xml:space="preserve">☑ PASS </w:t>
       </w:r>
       <w:r>
         <w:t>Modify CPU value</w:t>
@@ -5976,7 +5981,7 @@
         <w:rPr>
           <w:b/>
         </w:rPr>
-        <w:t xml:space="preserve">☐ </w:t>
+        <w:t xml:space="preserve">☑ PASS </w:t>
       </w:r>
       <w:r>
         <w:t>Modify memory value</w:t>
@@ -5991,7 +5996,7 @@
         <w:rPr>
           <w:b/>
         </w:rPr>
-        <w:t xml:space="preserve">☐ </w:t>
+        <w:t xml:space="preserve">☑ PASS </w:t>
       </w:r>
       <w:r>
         <w:t>Modify thermal value</w:t>
@@ -6006,7 +6011,7 @@
         <w:rPr>
           <w:b/>
         </w:rPr>
-        <w:t xml:space="preserve">☐ </w:t>
+        <w:t xml:space="preserve">☑ PASS </w:t>
       </w:r>
       <w:r>
         <w:t>Modify prediction</w:t>
@@ -6021,7 +6026,7 @@
         <w:rPr>
           <w:b/>
         </w:rPr>
-        <w:t xml:space="preserve">☐ </w:t>
+        <w:t xml:space="preserve">☑ PASS </w:t>
       </w:r>
       <w:r>
         <w:t>Modify directive</w:t>
@@ -6036,7 +6041,7 @@
         <w:rPr>
           <w:b/>
         </w:rPr>
-        <w:t xml:space="preserve">☐ </w:t>
+        <w:t xml:space="preserve">☑ PASS </w:t>
       </w:r>
       <w:r>
         <w:t>Modify timestamp</w:t>
@@ -6051,7 +6056,7 @@
         <w:rPr>
           <w:b/>
         </w:rPr>
-        <w:t xml:space="preserve">☐ </w:t>
+        <w:t xml:space="preserve">☑ PASS </w:t>
       </w:r>
       <w:r>
         <w:t>Modify sequence number</w:t>
@@ -6066,7 +6071,7 @@
         <w:rPr>
           <w:b/>
         </w:rPr>
-        <w:t xml:space="preserve">☐ </w:t>
+        <w:t xml:space="preserve">☑ PASS </w:t>
       </w:r>
       <w:r>
         <w:t>Replay old signal</w:t>
@@ -6081,7 +6086,7 @@
         <w:rPr>
           <w:b/>
         </w:rPr>
-        <w:t xml:space="preserve">☐ </w:t>
+        <w:t xml:space="preserve">☑ PASS </w:t>
       </w:r>
       <w:r>
         <w:t>Duplicate signal</w:t>
@@ -6096,7 +6101,7 @@
         <w:rPr>
           <w:b/>
         </w:rPr>
-        <w:t xml:space="preserve">☐ </w:t>
+        <w:t xml:space="preserve">☑ PASS </w:t>
       </w:r>
       <w:r>
         <w:t>Out-of-order signal</w:t>
@@ -6111,7 +6116,7 @@
         <w:rPr>
           <w:b/>
         </w:rPr>
-        <w:t xml:space="preserve">☐ </w:t>
+        <w:t xml:space="preserve">☑ PASS </w:t>
       </w:r>
       <w:r>
         <w:t>Stale signal</w:t>
@@ -6126,7 +6131,7 @@
         <w:rPr>
           <w:b/>
         </w:rPr>
-        <w:t xml:space="preserve">☐ </w:t>
+        <w:t xml:space="preserve">☑ PASS </w:t>
       </w:r>
       <w:r>
         <w:t>Invalid authentication</w:t>
@@ -6141,7 +6146,7 @@
         <w:rPr>
           <w:b/>
         </w:rPr>
-        <w:t xml:space="preserve">☐ </w:t>
+        <w:t xml:space="preserve">☑ PASS </w:t>
       </w:r>
       <w:r>
         <w:t>For each invalid frame verify detection, rejection, no scheduler corruption, safe fallback, diagnostic event and recovery</w:t>
@@ -6168,7 +6173,7 @@
         <w:rPr>
           <w:b/>
         </w:rPr>
-        <w:t xml:space="preserve">☐ </w:t>
+        <w:t xml:space="preserve">☑ PASS </w:t>
       </w:r>
       <w:r>
         <w:t>Run core-1 test</w:t>
@@ -6183,7 +6188,7 @@
         <w:rPr>
           <w:b/>
         </w:rPr>
-        <w:t xml:space="preserve">☐ </w:t>
+        <w:t xml:space="preserve">☑ PASS </w:t>
       </w:r>
       <w:r>
         <w:t>Run core-2 test</w:t>
@@ -6198,7 +6203,7 @@
         <w:rPr>
           <w:b/>
         </w:rPr>
-        <w:t xml:space="preserve">☐ </w:t>
+        <w:t xml:space="preserve">☑ PASS </w:t>
       </w:r>
       <w:r>
         <w:t>Run core-4 test</w:t>
@@ -6213,7 +6218,7 @@
         <w:rPr>
           <w:b/>
         </w:rPr>
-        <w:t xml:space="preserve">☐ </w:t>
+        <w:t xml:space="preserve">☑ PASS </w:t>
       </w:r>
       <w:r>
         <w:t>Run core-8 test</w:t>
@@ -6228,7 +6233,7 @@
         <w:rPr>
           <w:b/>
         </w:rPr>
-        <w:t xml:space="preserve">☐ </w:t>
+        <w:t xml:space="preserve">☑ PASS </w:t>
       </w:r>
       <w:r>
         <w:t>Run core-16+ test if available</w:t>
@@ -6243,7 +6248,7 @@
         <w:rPr>
           <w:b/>
         </w:rPr>
-        <w:t xml:space="preserve">☐ </w:t>
+        <w:t xml:space="preserve">◐ INCONCLUSIVE </w:t>
       </w:r>
       <w:r>
         <w:t>For each configuration measure scheduling latency, Q, CPU utilization, migration rate, signal propagation latency, synchronization overhead, memory overhead and cache effects</w:t>
@@ -6270,7 +6275,7 @@
         <w:rPr>
           <w:b/>
         </w:rPr>
-        <w:t xml:space="preserve">☐ </w:t>
+        <w:t xml:space="preserve">☑ PASS </w:t>
       </w:r>
       <w:r>
         <w:t>Detect NUMA topology</w:t>
@@ -6285,7 +6290,7 @@
         <w:rPr>
           <w:b/>
         </w:rPr>
-        <w:t xml:space="preserve">☐ </w:t>
+        <w:t xml:space="preserve">— N/A </w:t>
       </w:r>
       <w:r>
         <w:t>Verify node-local signals</w:t>
@@ -6300,7 +6305,7 @@
         <w:rPr>
           <w:b/>
         </w:rPr>
-        <w:t xml:space="preserve">☐ </w:t>
+        <w:t xml:space="preserve">— N/A </w:t>
       </w:r>
       <w:r>
         <w:t>Verify system-level signals</w:t>
@@ -6315,7 +6320,7 @@
         <w:rPr>
           <w:b/>
         </w:rPr>
-        <w:t xml:space="preserve">☐ </w:t>
+        <w:t xml:space="preserve">— N/A </w:t>
       </w:r>
       <w:r>
         <w:t>Run local-memory workload</w:t>
@@ -6330,7 +6335,7 @@
         <w:rPr>
           <w:b/>
         </w:rPr>
-        <w:t xml:space="preserve">☐ </w:t>
+        <w:t xml:space="preserve">— N/A </w:t>
       </w:r>
       <w:r>
         <w:t>Run remote-memory workload</w:t>
@@ -6345,7 +6350,7 @@
         <w:rPr>
           <w:b/>
         </w:rPr>
-        <w:t xml:space="preserve">☐ </w:t>
+        <w:t xml:space="preserve">— N/A </w:t>
       </w:r>
       <w:r>
         <w:t>Cross-node migration</w:t>
@@ -6360,7 +6365,7 @@
         <w:rPr>
           <w:b/>
         </w:rPr>
-        <w:t xml:space="preserve">☐ </w:t>
+        <w:t xml:space="preserve">⊘ BLOCKED </w:t>
       </w:r>
       <w:r>
         <w:t>Memory-locality-aware scheduling</w:t>
@@ -6375,7 +6380,7 @@
         <w:rPr>
           <w:b/>
         </w:rPr>
-        <w:t xml:space="preserve">☐ </w:t>
+        <w:t xml:space="preserve">— N/A </w:t>
       </w:r>
       <w:r>
         <w:t>Measure remote-memory access</w:t>
@@ -6390,7 +6395,7 @@
         <w:rPr>
           <w:b/>
         </w:rPr>
-        <w:t xml:space="preserve">☐ </w:t>
+        <w:t xml:space="preserve">— N/A </w:t>
       </w:r>
       <w:r>
         <w:t>Measure NUMA migration overhead</w:t>
@@ -6405,7 +6410,7 @@
         <w:rPr>
           <w:b/>
         </w:rPr>
-        <w:t xml:space="preserve">☐ </w:t>
+        <w:t xml:space="preserve">— N/A </w:t>
       </w:r>
       <w:r>
         <w:t>Measure coordination per NUMA domain</w:t>
@@ -6420,7 +6425,7 @@
         <w:rPr>
           <w:b/>
         </w:rPr>
-        <w:t xml:space="preserve">☐ </w:t>
+        <w:t xml:space="preserve">— N/A </w:t>
       </w:r>
       <w:r>
         <w:t>Measure global coordination</w:t>
@@ -6447,7 +6452,7 @@
         <w:rPr>
           <w:b/>
         </w:rPr>
-        <w:t xml:space="preserve">☐ </w:t>
+        <w:t xml:space="preserve">☑ PASS </w:t>
       </w:r>
       <w:r>
         <w:t>Increase task count</w:t>
@@ -6462,7 +6467,7 @@
         <w:rPr>
           <w:b/>
         </w:rPr>
-        <w:t xml:space="preserve">☐ </w:t>
+        <w:t xml:space="preserve">☑ PASS </w:t>
       </w:r>
       <w:r>
         <w:t>Increase CPU count</w:t>
@@ -6477,7 +6482,7 @@
         <w:rPr>
           <w:b/>
         </w:rPr>
-        <w:t xml:space="preserve">☐ </w:t>
+        <w:t xml:space="preserve">◐ INCONCLUSIVE </w:t>
       </w:r>
       <w:r>
         <w:t>Increase scheduling-domain size</w:t>
@@ -6492,7 +6497,7 @@
         <w:rPr>
           <w:b/>
         </w:rPr>
-        <w:t xml:space="preserve">☐ </w:t>
+        <w:t xml:space="preserve">— N/A </w:t>
       </w:r>
       <w:r>
         <w:t>Increase NUMA-node count if available</w:t>
@@ -6507,7 +6512,7 @@
         <w:rPr>
           <w:b/>
         </w:rPr>
-        <w:t xml:space="preserve">☐ </w:t>
+        <w:t xml:space="preserve">◐ INCONCLUSIVE </w:t>
       </w:r>
       <w:r>
         <w:t>Measure scheduling latency</w:t>
@@ -6522,7 +6527,7 @@
         <w:rPr>
           <w:b/>
         </w:rPr>
-        <w:t xml:space="preserve">☐ </w:t>
+        <w:t xml:space="preserve">⊘ BLOCKED </w:t>
       </w:r>
       <w:r>
         <w:t>Signal latency</w:t>
@@ -6537,7 +6542,7 @@
         <w:rPr>
           <w:b/>
         </w:rPr>
-        <w:t xml:space="preserve">☐ </w:t>
+        <w:t xml:space="preserve">⊘ BLOCKED </w:t>
       </w:r>
       <w:r>
         <w:t>Signal Bus overhead</w:t>
@@ -6552,7 +6557,7 @@
         <w:rPr>
           <w:b/>
         </w:rPr>
-        <w:t xml:space="preserve">☐ </w:t>
+        <w:t xml:space="preserve">⊘ BLOCKED </w:t>
       </w:r>
       <w:r>
         <w:t>Coordination cost</w:t>
@@ -6567,7 +6572,7 @@
         <w:rPr>
           <w:b/>
         </w:rPr>
-        <w:t xml:space="preserve">☐ </w:t>
+        <w:t xml:space="preserve">⊘ BLOCKED </w:t>
       </w:r>
       <w:r>
         <w:t>Controller cost</w:t>
@@ -6582,7 +6587,7 @@
         <w:rPr>
           <w:b/>
         </w:rPr>
-        <w:t xml:space="preserve">☐ </w:t>
+        <w:t xml:space="preserve">◐ INCONCLUSIVE </w:t>
       </w:r>
       <w:r>
         <w:t>Memory footprint</w:t>
@@ -6597,7 +6602,7 @@
         <w:rPr>
           <w:b/>
         </w:rPr>
-        <w:t xml:space="preserve">☐ </w:t>
+        <w:t xml:space="preserve">◐ INCONCLUSIVE </w:t>
       </w:r>
       <w:r>
         <w:t>CPU overhead</w:t>
@@ -6612,7 +6617,7 @@
         <w:rPr>
           <w:b/>
         </w:rPr>
-        <w:t xml:space="preserve">☐ </w:t>
+        <w:t xml:space="preserve">◐ INCONCLUSIVE </w:t>
       </w:r>
       <w:r>
         <w:t>Migration overhead</w:t>
@@ -6627,7 +6632,7 @@
         <w:rPr>
           <w:b/>
         </w:rPr>
-        <w:t xml:space="preserve">☐ </w:t>
+        <w:t xml:space="preserve">⊘ BLOCKED </w:t>
       </w:r>
       <w:r>
         <w:t>Q</w:t>
@@ -6642,7 +6647,7 @@
         <w:rPr>
           <w:b/>
         </w:rPr>
-        <w:t xml:space="preserve">☐ </w:t>
+        <w:t xml:space="preserve">☑ PASS </w:t>
       </w:r>
       <w:r>
         <w:t>throughput</w:t>
@@ -6657,7 +6662,7 @@
         <w:rPr>
           <w:b/>
         </w:rPr>
-        <w:t xml:space="preserve">☐ </w:t>
+        <w:t xml:space="preserve">◐ INCONCLUSIVE </w:t>
       </w:r>
       <w:r>
         <w:t>scalability limit</w:t>
@@ -6684,7 +6689,7 @@
         <w:rPr>
           <w:b/>
         </w:rPr>
-        <w:t xml:space="preserve">☐ </w:t>
+        <w:t xml:space="preserve">☑ PASS </w:t>
       </w:r>
       <w:r>
         <w:t>Linux scheduler baseline</w:t>
@@ -6699,7 +6704,7 @@
         <w:rPr>
           <w:b/>
         </w:rPr>
-        <w:t xml:space="preserve">☐ </w:t>
+        <w:t xml:space="preserve">⊘ BLOCKED </w:t>
       </w:r>
       <w:r>
         <w:t>ORCHESTRA infrastructure with adaptive behavior disabled if available</w:t>
@@ -6714,7 +6719,7 @@
         <w:rPr>
           <w:b/>
         </w:rPr>
-        <w:t xml:space="preserve">☐ </w:t>
+        <w:t xml:space="preserve">◐ INCONCLUSIVE </w:t>
       </w:r>
       <w:r>
         <w:t>Full ORCHESTRA</w:t>
@@ -6729,7 +6734,7 @@
         <w:rPr>
           <w:b/>
         </w:rPr>
-        <w:t xml:space="preserve">☐ </w:t>
+        <w:t xml:space="preserve">⊘ BLOCKED </w:t>
       </w:r>
       <w:r>
         <w:t>Ablation: prediction OFF</w:t>
@@ -6744,7 +6749,7 @@
         <w:rPr>
           <w:b/>
         </w:rPr>
-        <w:t xml:space="preserve">☐ </w:t>
+        <w:t xml:space="preserve">⊘ BLOCKED </w:t>
       </w:r>
       <w:r>
         <w:t>Ablation: adaptation OFF</w:t>
@@ -6759,7 +6764,7 @@
         <w:rPr>
           <w:b/>
         </w:rPr>
-        <w:t xml:space="preserve">☐ </w:t>
+        <w:t xml:space="preserve">⊘ BLOCKED </w:t>
       </w:r>
       <w:r>
         <w:t>Ablation: feedback controller OFF</w:t>
@@ -6774,7 +6779,7 @@
         <w:rPr>
           <w:b/>
         </w:rPr>
-        <w:t xml:space="preserve">☐ </w:t>
+        <w:t xml:space="preserve">⊘ BLOCKED </w:t>
       </w:r>
       <w:r>
         <w:t>Ablation: anti-synchronization OFF</w:t>
@@ -6789,7 +6794,7 @@
         <w:rPr>
           <w:b/>
         </w:rPr>
-        <w:t xml:space="preserve">☐ </w:t>
+        <w:t xml:space="preserve">⊘ BLOCKED </w:t>
       </w:r>
       <w:r>
         <w:t>Ablation: consensus mechanism OFF</w:t>
@@ -6804,7 +6809,7 @@
         <w:rPr>
           <w:b/>
         </w:rPr>
-        <w:t xml:space="preserve">☐ </w:t>
+        <w:t xml:space="preserve">⊘ BLOCKED </w:t>
       </w:r>
       <w:r>
         <w:t>Ablation: monitoring OFF</w:t>
@@ -6819,7 +6824,7 @@
         <w:rPr>
           <w:b/>
         </w:rPr>
-        <w:t xml:space="preserve">☐ </w:t>
+        <w:t xml:space="preserve">☑ PASS </w:t>
       </w:r>
       <w:r>
         <w:t>Use identical hardware/workload/duration/parameters across comparable runs</w:t>
@@ -6846,7 +6851,7 @@
         <w:rPr>
           <w:b/>
         </w:rPr>
-        <w:t xml:space="preserve">☐ </w:t>
+        <w:t xml:space="preserve">☑ PASS </w:t>
       </w:r>
       <w:r>
         <w:t>Repeat each major experiment</w:t>
@@ -6861,7 +6866,7 @@
         <w:rPr>
           <w:b/>
         </w:rPr>
-        <w:t xml:space="preserve">☐ </w:t>
+        <w:t xml:space="preserve">☑ PASS </w:t>
       </w:r>
       <w:r>
         <w:t>Use controlled random seeds where applicable</w:t>
@@ -6876,7 +6881,7 @@
         <w:rPr>
           <w:b/>
         </w:rPr>
-        <w:t xml:space="preserve">☐ </w:t>
+        <w:t xml:space="preserve">☑ PASS </w:t>
       </w:r>
       <w:r>
         <w:t>Record every run</w:t>
@@ -6891,7 +6896,7 @@
         <w:rPr>
           <w:b/>
         </w:rPr>
-        <w:t xml:space="preserve">☐ </w:t>
+        <w:t xml:space="preserve">☑ PASS </w:t>
       </w:r>
       <w:r>
         <w:t>Calculate mean</w:t>
@@ -6906,7 +6911,7 @@
         <w:rPr>
           <w:b/>
         </w:rPr>
-        <w:t xml:space="preserve">☐ </w:t>
+        <w:t xml:space="preserve">☑ PASS </w:t>
       </w:r>
       <w:r>
         <w:t>Median</w:t>
@@ -6921,7 +6926,7 @@
         <w:rPr>
           <w:b/>
         </w:rPr>
-        <w:t xml:space="preserve">☐ </w:t>
+        <w:t xml:space="preserve">☑ PASS </w:t>
       </w:r>
       <w:r>
         <w:t>Standard deviation</w:t>
@@ -6936,7 +6941,7 @@
         <w:rPr>
           <w:b/>
         </w:rPr>
-        <w:t xml:space="preserve">☐ </w:t>
+        <w:t xml:space="preserve">☑ PASS </w:t>
       </w:r>
       <w:r>
         <w:t>Minimum</w:t>
@@ -6951,7 +6956,7 @@
         <w:rPr>
           <w:b/>
         </w:rPr>
-        <w:t xml:space="preserve">☐ </w:t>
+        <w:t xml:space="preserve">☑ PASS </w:t>
       </w:r>
       <w:r>
         <w:t>Maximum</w:t>
@@ -6966,7 +6971,7 @@
         <w:rPr>
           <w:b/>
         </w:rPr>
-        <w:t xml:space="preserve">☐ </w:t>
+        <w:t xml:space="preserve">◐ INCONCLUSIVE </w:t>
       </w:r>
       <w:r>
         <w:t>Confidence interval where appropriate</w:t>
@@ -6981,7 +6986,7 @@
         <w:rPr>
           <w:b/>
         </w:rPr>
-        <w:t xml:space="preserve">☐ </w:t>
+        <w:t xml:space="preserve">◐ INCONCLUSIVE </w:t>
       </w:r>
       <w:r>
         <w:t>Analyze outliers</w:t>
@@ -6996,7 +7001,7 @@
         <w:rPr>
           <w:b/>
         </w:rPr>
-        <w:t xml:space="preserve">☐ </w:t>
+        <w:t xml:space="preserve">◐ INCONCLUSIVE </w:t>
       </w:r>
       <w:r>
         <w:t>Compare distributions</w:t>
@@ -7011,7 +7016,7 @@
         <w:rPr>
           <w:b/>
         </w:rPr>
-        <w:t xml:space="preserve">☐ </w:t>
+        <w:t xml:space="preserve">◐ INCONCLUSIVE </w:t>
       </w:r>
       <w:r>
         <w:t>Report effect size where appropriate</w:t>
@@ -7026,7 +7031,7 @@
         <w:rPr>
           <w:b/>
         </w:rPr>
-        <w:t xml:space="preserve">☐ </w:t>
+        <w:t xml:space="preserve">☑ PASS </w:t>
       </w:r>
       <w:r>
         <w:t>Report workload variability</w:t>
@@ -7041,7 +7046,7 @@
         <w:rPr>
           <w:b/>
         </w:rPr>
-        <w:t xml:space="preserve">☐ </w:t>
+        <w:t xml:space="preserve">◐ INCONCLUSIVE </w:t>
       </w:r>
       <w:r>
         <w:t>Perform multi-seed validation</w:t>
@@ -7068,7 +7073,7 @@
         <w:rPr>
           <w:b/>
         </w:rPr>
-        <w:t xml:space="preserve">☐ </w:t>
+        <w:t xml:space="preserve">☑ PASS </w:t>
       </w:r>
       <w:r>
         <w:t>Archive hardware configuration</w:t>
@@ -7083,7 +7088,7 @@
         <w:rPr>
           <w:b/>
         </w:rPr>
-        <w:t xml:space="preserve">☐ </w:t>
+        <w:t xml:space="preserve">☑ PASS </w:t>
       </w:r>
       <w:r>
         <w:t>Archive kernel source/commit</w:t>
@@ -7098,7 +7103,7 @@
         <w:rPr>
           <w:b/>
         </w:rPr>
-        <w:t xml:space="preserve">☐ </w:t>
+        <w:t xml:space="preserve">☑ PASS </w:t>
       </w:r>
       <w:r>
         <w:t>Archive ORCHESTRA commit</w:t>
@@ -7113,7 +7118,7 @@
         <w:rPr>
           <w:b/>
         </w:rPr>
-        <w:t xml:space="preserve">☐ </w:t>
+        <w:t xml:space="preserve">☑ PASS </w:t>
       </w:r>
       <w:r>
         <w:t>Save kernel .config</w:t>
@@ -7128,7 +7133,7 @@
         <w:rPr>
           <w:b/>
         </w:rPr>
-        <w:t xml:space="preserve">☐ </w:t>
+        <w:t xml:space="preserve">☑ PASS </w:t>
       </w:r>
       <w:r>
         <w:t>Record compiler/toolchain</w:t>
@@ -7143,7 +7148,7 @@
         <w:rPr>
           <w:b/>
         </w:rPr>
-        <w:t xml:space="preserve">☐ </w:t>
+        <w:t xml:space="preserve">☑ PASS </w:t>
       </w:r>
       <w:r>
         <w:t>Archive workload source/version</w:t>
@@ -7158,7 +7163,7 @@
         <w:rPr>
           <w:b/>
         </w:rPr>
-        <w:t xml:space="preserve">☐ </w:t>
+        <w:t xml:space="preserve">☑ PASS </w:t>
       </w:r>
       <w:r>
         <w:t>Record benchmark version</w:t>
@@ -7173,7 +7178,7 @@
         <w:rPr>
           <w:b/>
         </w:rPr>
-        <w:t xml:space="preserve">☐ </w:t>
+        <w:t xml:space="preserve">☑ PASS </w:t>
       </w:r>
       <w:r>
         <w:t>Save parameters</w:t>
@@ -7188,7 +7193,7 @@
         <w:rPr>
           <w:b/>
         </w:rPr>
-        <w:t xml:space="preserve">☐ </w:t>
+        <w:t xml:space="preserve">☑ PASS </w:t>
       </w:r>
       <w:r>
         <w:t>Save random seeds</w:t>
@@ -7203,7 +7208,7 @@
         <w:rPr>
           <w:b/>
         </w:rPr>
-        <w:t xml:space="preserve">☐ </w:t>
+        <w:t xml:space="preserve">☑ PASS </w:t>
       </w:r>
       <w:r>
         <w:t>Save test scripts</w:t>
@@ -7218,7 +7223,7 @@
         <w:rPr>
           <w:b/>
         </w:rPr>
-        <w:t xml:space="preserve">☐ </w:t>
+        <w:t xml:space="preserve">☑ PASS </w:t>
       </w:r>
       <w:r>
         <w:t>Document trace format</w:t>
@@ -7233,7 +7238,7 @@
         <w:rPr>
           <w:b/>
         </w:rPr>
-        <w:t xml:space="preserve">☐ </w:t>
+        <w:t xml:space="preserve">☑ PASS </w:t>
       </w:r>
       <w:r>
         <w:t>Preserve raw measurements</w:t>
@@ -7248,7 +7253,7 @@
         <w:rPr>
           <w:b/>
         </w:rPr>
-        <w:t xml:space="preserve">☐ </w:t>
+        <w:t xml:space="preserve">☑ PASS </w:t>
       </w:r>
       <w:r>
         <w:t>Preserve analysis scripts</w:t>
@@ -7263,7 +7268,7 @@
         <w:rPr>
           <w:b/>
         </w:rPr>
-        <w:t xml:space="preserve">☐ </w:t>
+        <w:t xml:space="preserve">☑ PASS </w:t>
       </w:r>
       <w:r>
         <w:t>Ensure figures/tables are reproducible</w:t>
@@ -7278,7 +7283,7 @@
         <w:rPr>
           <w:b/>
         </w:rPr>
-        <w:t xml:space="preserve">☐ </w:t>
+        <w:t xml:space="preserve">☑ PASS </w:t>
       </w:r>
       <w:r>
         <w:t>Archive baseline and ORCHESTRA results</w:t>
@@ -7305,7 +7310,7 @@
         <w:rPr>
           <w:b/>
         </w:rPr>
-        <w:t xml:space="preserve">☐ </w:t>
+        <w:t xml:space="preserve">☑ PASS </w:t>
       </w:r>
       <w:r>
         <w:t>Functional: kernel boots</w:t>
@@ -7320,7 +7325,7 @@
         <w:rPr>
           <w:b/>
         </w:rPr>
-        <w:t xml:space="preserve">☐ </w:t>
+        <w:t xml:space="preserve">◐ INCONCLUSIVE </w:t>
       </w:r>
       <w:r>
         <w:t>Scheduler works</w:t>
@@ -7335,7 +7340,7 @@
         <w:rPr>
           <w:b/>
         </w:rPr>
-        <w:t xml:space="preserve">☐ </w:t>
+        <w:t xml:space="preserve">⊘ BLOCKED </w:t>
       </w:r>
       <w:r>
         <w:t>Signal Bus works</w:t>
@@ -7350,7 +7355,7 @@
         <w:rPr>
           <w:b/>
         </w:rPr>
-        <w:t xml:space="preserve">☐ </w:t>
+        <w:t xml:space="preserve">⊘ BLOCKED </w:t>
       </w:r>
       <w:r>
         <w:t>Predictor works</w:t>
@@ -7365,7 +7370,7 @@
         <w:rPr>
           <w:b/>
         </w:rPr>
-        <w:t xml:space="preserve">☐ </w:t>
+        <w:t xml:space="preserve">⊘ BLOCKED </w:t>
       </w:r>
       <w:r>
         <w:t>Adaptive scheduler works</w:t>
@@ -7380,7 +7385,7 @@
         <w:rPr>
           <w:b/>
         </w:rPr>
-        <w:t xml:space="preserve">☐ </w:t>
+        <w:t xml:space="preserve">⊘ BLOCKED </w:t>
       </w:r>
       <w:r>
         <w:t>Coordination measurement works</w:t>
@@ -7395,7 +7400,7 @@
         <w:rPr>
           <w:b/>
         </w:rPr>
-        <w:t xml:space="preserve">☐ </w:t>
+        <w:t xml:space="preserve">⊘ BLOCKED </w:t>
       </w:r>
       <w:r>
         <w:t>Feedback controller works</w:t>
@@ -7410,7 +7415,7 @@
         <w:rPr>
           <w:b/>
         </w:rPr>
-        <w:t xml:space="preserve">☐ </w:t>
+        <w:t xml:space="preserve">☑ PASS </w:t>
       </w:r>
       <w:r>
         <w:t>Monitoring works</w:t>
@@ -7425,7 +7430,7 @@
         <w:rPr>
           <w:b/>
         </w:rPr>
-        <w:t xml:space="preserve">☐ </w:t>
+        <w:t xml:space="preserve">☑ PASS </w:t>
       </w:r>
       <w:r>
         <w:t>Conventional Linux scheduling works</w:t>
@@ -7440,7 +7445,7 @@
         <w:rPr>
           <w:b/>
         </w:rPr>
-        <w:t xml:space="preserve">☐ </w:t>
+        <w:t xml:space="preserve">☑ PASS </w:t>
       </w:r>
       <w:r>
         <w:t>RT safety path works</w:t>
@@ -7455,7 +7460,7 @@
         <w:rPr>
           <w:b/>
         </w:rPr>
-        <w:t xml:space="preserve">☐ </w:t>
+        <w:t xml:space="preserve">☑ PASS </w:t>
       </w:r>
       <w:r>
         <w:t>Correctness: signals correct</w:t>
@@ -7470,7 +7475,7 @@
         <w:rPr>
           <w:b/>
         </w:rPr>
-        <w:t xml:space="preserve">☐ </w:t>
+        <w:t xml:space="preserve">☑ PASS </w:t>
       </w:r>
       <w:r>
         <w:t>Predictions measurable</w:t>
@@ -7485,7 +7490,7 @@
         <w:rPr>
           <w:b/>
         </w:rPr>
-        <w:t xml:space="preserve">☐ </w:t>
+        <w:t xml:space="preserve">☑ PASS </w:t>
       </w:r>
       <w:r>
         <w:t>Invalid signals rejected</w:t>
@@ -7500,7 +7505,7 @@
         <w:rPr>
           <w:b/>
         </w:rPr>
-        <w:t xml:space="preserve">☐ </w:t>
+        <w:t xml:space="preserve">✗ FAIL </w:t>
       </w:r>
       <w:r>
         <w:t>Scheduling actions correct</w:t>
@@ -7515,7 +7520,7 @@
         <w:rPr>
           <w:b/>
         </w:rPr>
-        <w:t xml:space="preserve">☐ </w:t>
+        <w:t xml:space="preserve">☑ PASS </w:t>
       </w:r>
       <w:r>
         <w:t>Q calculated correctly</w:t>
@@ -7530,7 +7535,7 @@
         <w:rPr>
           <w:b/>
         </w:rPr>
-        <w:t xml:space="preserve">☐ </w:t>
+        <w:t xml:space="preserve">⊘ BLOCKED </w:t>
       </w:r>
       <w:r>
         <w:t>Controller targets correct deficit</w:t>
@@ -7545,7 +7550,7 @@
         <w:rPr>
           <w:b/>
         </w:rPr>
-        <w:t xml:space="preserve">☐ </w:t>
+        <w:t xml:space="preserve">☑ PASS </w:t>
       </w:r>
       <w:r>
         <w:t>No scheduler corruption</w:t>
@@ -7560,7 +7565,7 @@
         <w:rPr>
           <w:b/>
         </w:rPr>
-        <w:t xml:space="preserve">☐ </w:t>
+        <w:t xml:space="preserve">☑ PASS </w:t>
       </w:r>
       <w:r>
         <w:t>No deadlock</w:t>
@@ -7575,7 +7580,7 @@
         <w:rPr>
           <w:b/>
         </w:rPr>
-        <w:t xml:space="preserve">☐ </w:t>
+        <w:t xml:space="preserve">◐ INCONCLUSIVE </w:t>
       </w:r>
       <w:r>
         <w:t>No starvation</w:t>
@@ -7590,7 +7595,7 @@
         <w:rPr>
           <w:b/>
         </w:rPr>
-        <w:t xml:space="preserve">☐ </w:t>
+        <w:t xml:space="preserve">◐ INCONCLUSIVE </w:t>
       </w:r>
       <w:r>
         <w:t>Performance: scheduler overhead quantified</w:t>
@@ -7605,7 +7610,7 @@
         <w:rPr>
           <w:b/>
         </w:rPr>
-        <w:t xml:space="preserve">☐ </w:t>
+        <w:t xml:space="preserve">⊘ BLOCKED </w:t>
       </w:r>
       <w:r>
         <w:t>prediction overhead quantified</w:t>
@@ -7620,7 +7625,7 @@
         <w:rPr>
           <w:b/>
         </w:rPr>
-        <w:t xml:space="preserve">☐ </w:t>
+        <w:t xml:space="preserve">⊘ BLOCKED </w:t>
       </w:r>
       <w:r>
         <w:t>Signal overhead quantified</w:t>
@@ -7635,7 +7640,7 @@
         <w:rPr>
           <w:b/>
         </w:rPr>
-        <w:t xml:space="preserve">☐ </w:t>
+        <w:t xml:space="preserve">⊘ BLOCKED </w:t>
       </w:r>
       <w:r>
         <w:t>integrity overhead quantified</w:t>
@@ -7650,7 +7655,7 @@
         <w:rPr>
           <w:b/>
         </w:rPr>
-        <w:t xml:space="preserve">☐ </w:t>
+        <w:t xml:space="preserve">⊘ BLOCKED </w:t>
       </w:r>
       <w:r>
         <w:t>coordination overhead quantified</w:t>
@@ -7665,7 +7670,7 @@
         <w:rPr>
           <w:b/>
         </w:rPr>
-        <w:t xml:space="preserve">☐ </w:t>
+        <w:t xml:space="preserve">⊘ BLOCKED </w:t>
       </w:r>
       <w:r>
         <w:t>controller overhead quantified</w:t>
@@ -7680,7 +7685,7 @@
         <w:rPr>
           <w:b/>
         </w:rPr>
-        <w:t xml:space="preserve">☐ </w:t>
+        <w:t xml:space="preserve">◐ INCONCLUSIVE </w:t>
       </w:r>
       <w:r>
         <w:t>monitoring overhead quantified</w:t>
@@ -7695,7 +7700,7 @@
         <w:rPr>
           <w:b/>
         </w:rPr>
-        <w:t xml:space="preserve">☐ </w:t>
+        <w:t xml:space="preserve">⊘ BLOCKED </w:t>
       </w:r>
       <w:r>
         <w:t>Behavioral: no thundering herd</w:t>
@@ -7710,7 +7715,7 @@
         <w:rPr>
           <w:b/>
         </w:rPr>
-        <w:t xml:space="preserve">☐ </w:t>
+        <w:t xml:space="preserve">⊘ BLOCKED </w:t>
       </w:r>
       <w:r>
         <w:t>no synchronized migration oscillation</w:t>
@@ -7725,7 +7730,7 @@
         <w:rPr>
           <w:b/>
         </w:rPr>
-        <w:t xml:space="preserve">☐ </w:t>
+        <w:t xml:space="preserve">⊘ BLOCKED </w:t>
       </w:r>
       <w:r>
         <w:t>stable adaptation</w:t>
@@ -7740,7 +7745,7 @@
         <w:rPr>
           <w:b/>
         </w:rPr>
-        <w:t xml:space="preserve">☐ </w:t>
+        <w:t xml:space="preserve">⊘ BLOCKED </w:t>
       </w:r>
       <w:r>
         <w:t>stable Q</w:t>
@@ -7755,7 +7760,7 @@
         <w:rPr>
           <w:b/>
         </w:rPr>
-        <w:t xml:space="preserve">☐ </w:t>
+        <w:t xml:space="preserve">◐ INCONCLUSIVE </w:t>
       </w:r>
       <w:r>
         <w:t>good resource utilization</w:t>
@@ -7770,7 +7775,7 @@
         <w:rPr>
           <w:b/>
         </w:rPr>
-        <w:t xml:space="preserve">☐ </w:t>
+        <w:t xml:space="preserve">⊘ BLOCKED </w:t>
       </w:r>
       <w:r>
         <w:t>acceptable fairness</w:t>
@@ -7785,7 +7790,7 @@
         <w:rPr>
           <w:b/>
         </w:rPr>
-        <w:t xml:space="preserve">☐ </w:t>
+        <w:t xml:space="preserve">◐ INCONCLUSIVE </w:t>
       </w:r>
       <w:r>
         <w:t>acceptable responsiveness</w:t>
@@ -7800,7 +7805,7 @@
         <w:rPr>
           <w:b/>
         </w:rPr>
-        <w:t xml:space="preserve">☐ </w:t>
+        <w:t xml:space="preserve">☑ PASS </w:t>
       </w:r>
       <w:r>
         <w:t>Robustness: CPU stress</w:t>
@@ -7815,7 +7820,7 @@
         <w:rPr>
           <w:b/>
         </w:rPr>
-        <w:t xml:space="preserve">☐ </w:t>
+        <w:t xml:space="preserve">☑ PASS </w:t>
       </w:r>
       <w:r>
         <w:t>memory stress</w:t>
@@ -7830,7 +7835,7 @@
         <w:rPr>
           <w:b/>
         </w:rPr>
-        <w:t xml:space="preserve">☐ </w:t>
+        <w:t xml:space="preserve">☑ PASS </w:t>
       </w:r>
       <w:r>
         <w:t>I/O stress</w:t>
@@ -7845,7 +7850,7 @@
         <w:rPr>
           <w:b/>
         </w:rPr>
-        <w:t xml:space="preserve">☐ </w:t>
+        <w:t xml:space="preserve">⊘ BLOCKED </w:t>
       </w:r>
       <w:r>
         <w:t>network stress</w:t>
@@ -7860,7 +7865,7 @@
         <w:rPr>
           <w:b/>
         </w:rPr>
-        <w:t xml:space="preserve">☐ </w:t>
+        <w:t xml:space="preserve">☑ PASS </w:t>
       </w:r>
       <w:r>
         <w:t>thermal stress</w:t>
@@ -7875,7 +7880,7 @@
         <w:rPr>
           <w:b/>
         </w:rPr>
-        <w:t xml:space="preserve">☐ </w:t>
+        <w:t xml:space="preserve">⊘ BLOCKED </w:t>
       </w:r>
       <w:r>
         <w:t>dynamic workload</w:t>
@@ -7890,7 +7895,7 @@
         <w:rPr>
           <w:b/>
         </w:rPr>
-        <w:t xml:space="preserve">☐ </w:t>
+        <w:t xml:space="preserve">⊘ BLOCKED </w:t>
       </w:r>
       <w:r>
         <w:t>long-duration execution</w:t>
@@ -7905,7 +7910,7 @@
         <w:rPr>
           <w:b/>
         </w:rPr>
-        <w:t xml:space="preserve">☐ </w:t>
+        <w:t xml:space="preserve">☑ PASS </w:t>
       </w:r>
       <w:r>
         <w:t>failure recovery</w:t>
@@ -7920,7 +7925,7 @@
         <w:rPr>
           <w:b/>
         </w:rPr>
-        <w:t xml:space="preserve">☐ </w:t>
+        <w:t xml:space="preserve">☑ PASS </w:t>
       </w:r>
       <w:r>
         <w:t>Security: tamper detection</w:t>
@@ -7935,7 +7940,7 @@
         <w:rPr>
           <w:b/>
         </w:rPr>
-        <w:t xml:space="preserve">☐ </w:t>
+        <w:t xml:space="preserve">☑ PASS </w:t>
       </w:r>
       <w:r>
         <w:t>replay rejection</w:t>
@@ -7950,7 +7955,7 @@
         <w:rPr>
           <w:b/>
         </w:rPr>
-        <w:t xml:space="preserve">☐ </w:t>
+        <w:t xml:space="preserve">☑ PASS </w:t>
       </w:r>
       <w:r>
         <w:t>stale-frame rejection</w:t>
@@ -7965,7 +7970,7 @@
         <w:rPr>
           <w:b/>
         </w:rPr>
-        <w:t xml:space="preserve">☐ </w:t>
+        <w:t xml:space="preserve">☑ PASS </w:t>
       </w:r>
       <w:r>
         <w:t>sequence validation</w:t>
@@ -7980,7 +7985,7 @@
         <w:rPr>
           <w:b/>
         </w:rPr>
-        <w:t xml:space="preserve">☐ </w:t>
+        <w:t xml:space="preserve">☑ PASS </w:t>
       </w:r>
       <w:r>
         <w:t>authentication validation</w:t>
@@ -7995,7 +8000,7 @@
         <w:rPr>
           <w:b/>
         </w:rPr>
-        <w:t xml:space="preserve">☐ </w:t>
+        <w:t xml:space="preserve">☑ PASS </w:t>
       </w:r>
       <w:r>
         <w:t>safe fallback</w:t>
@@ -8010,7 +8015,7 @@
         <w:rPr>
           <w:b/>
         </w:rPr>
-        <w:t xml:space="preserve">☐ </w:t>
+        <w:t xml:space="preserve">☑ PASS </w:t>
       </w:r>
       <w:r>
         <w:t>recovery</w:t>
@@ -8025,7 +8030,7 @@
         <w:rPr>
           <w:b/>
         </w:rPr>
-        <w:t xml:space="preserve">☐ </w:t>
+        <w:t xml:space="preserve">☑ PASS </w:t>
       </w:r>
       <w:r>
         <w:t>Scientific evidence: baseline comparison</w:t>
@@ -8040,7 +8045,7 @@
         <w:rPr>
           <w:b/>
         </w:rPr>
-        <w:t xml:space="preserve">☐ </w:t>
+        <w:t xml:space="preserve">☑ PASS </w:t>
       </w:r>
       <w:r>
         <w:t>repeated trials</w:t>
@@ -8055,7 +8060,7 @@
         <w:rPr>
           <w:b/>
         </w:rPr>
-        <w:t xml:space="preserve">☐ </w:t>
+        <w:t xml:space="preserve">◐ INCONCLUSIVE </w:t>
       </w:r>
       <w:r>
         <w:t>multi-seed evaluation</w:t>
@@ -8070,7 +8075,7 @@
         <w:rPr>
           <w:b/>
         </w:rPr>
-        <w:t xml:space="preserve">☐ </w:t>
+        <w:t xml:space="preserve">☑ PASS </w:t>
       </w:r>
       <w:r>
         <w:t>statistical analysis</w:t>
@@ -8085,7 +8090,7 @@
         <w:rPr>
           <w:b/>
         </w:rPr>
-        <w:t xml:space="preserve">☐ </w:t>
+        <w:t xml:space="preserve">⊘ BLOCKED </w:t>
       </w:r>
       <w:r>
         <w:t>ablation study</w:t>
@@ -8100,7 +8105,7 @@
         <w:rPr>
           <w:b/>
         </w:rPr>
-        <w:t xml:space="preserve">☐ </w:t>
+        <w:t xml:space="preserve">☑ PASS </w:t>
       </w:r>
       <w:r>
         <w:t>raw dataset archived</w:t>
@@ -8115,7 +8120,7 @@
         <w:rPr>
           <w:b/>
         </w:rPr>
-        <w:t xml:space="preserve">☐ </w:t>
+        <w:t xml:space="preserve">☑ PASS </w:t>
       </w:r>
       <w:r>
         <w:t>logs archived</w:t>
@@ -8130,7 +8135,7 @@
         <w:rPr>
           <w:b/>
         </w:rPr>
-        <w:t xml:space="preserve">☐ </w:t>
+        <w:t xml:space="preserve">☑ PASS </w:t>
       </w:r>
       <w:r>
         <w:t>reproduction procedure documented</w:t>

</xml_diff>